<commit_message>
Going to create a new branch called LFM
</commit_message>
<xml_diff>
--- a/Paper_AE.docx
+++ b/Paper_AE.docx
@@ -1,23 +1,23 @@
 
 <file path=word/document.xml><?xml version="1.0" encoding="utf-8"?>
-<w:document xmlns:w="http://schemas.openxmlformats.org/wordprocessingml/2006/main" xmlns:m="http://schemas.openxmlformats.org/officeDocument/2006/math" xmlns:r="http://schemas.openxmlformats.org/officeDocument/2006/relationships" xmlns:o="urn:schemas-microsoft-com:office:office" xmlns:v="urn:schemas-microsoft-com:vml" xmlns:w10="urn:schemas-microsoft-com:office:word" xmlns:a="http://schemas.openxmlformats.org/drawingml/2006/main" xmlns:pic="http://schemas.openxmlformats.org/drawingml/2006/picture" xmlns:wp="http://schemas.openxmlformats.org/drawingml/2006/wordprocessingDrawing">
+<w:document xmlns:wpc="http://schemas.microsoft.com/office/word/2010/wordprocessingCanvas" xmlns:cx="http://schemas.microsoft.com/office/drawing/2014/chartex" xmlns:cx1="http://schemas.microsoft.com/office/drawing/2015/9/8/chartex" xmlns:cx2="http://schemas.microsoft.com/office/drawing/2015/10/21/chartex" xmlns:cx3="http://schemas.microsoft.com/office/drawing/2016/5/9/chartex" xmlns:cx4="http://schemas.microsoft.com/office/drawing/2016/5/10/chartex" xmlns:cx5="http://schemas.microsoft.com/office/drawing/2016/5/11/chartex" xmlns:cx6="http://schemas.microsoft.com/office/drawing/2016/5/12/chartex" xmlns:cx7="http://schemas.microsoft.com/office/drawing/2016/5/13/chartex" xmlns:cx8="http://schemas.microsoft.com/office/drawing/2016/5/14/chartex" xmlns:mc="http://schemas.openxmlformats.org/markup-compatibility/2006" xmlns:aink="http://schemas.microsoft.com/office/drawing/2016/ink" xmlns:am3d="http://schemas.microsoft.com/office/drawing/2017/model3d" xmlns:o="urn:schemas-microsoft-com:office:office" xmlns:oel="http://schemas.microsoft.com/office/2019/extlst" xmlns:r="http://schemas.openxmlformats.org/officeDocument/2006/relationships" xmlns:m="http://schemas.openxmlformats.org/officeDocument/2006/math" xmlns:v="urn:schemas-microsoft-com:vml" xmlns:wp14="http://schemas.microsoft.com/office/word/2010/wordprocessingDrawing" xmlns:wp="http://schemas.openxmlformats.org/drawingml/2006/wordprocessingDrawing" xmlns:w10="urn:schemas-microsoft-com:office:word" xmlns:w="http://schemas.openxmlformats.org/wordprocessingml/2006/main" xmlns:w14="http://schemas.microsoft.com/office/word/2010/wordml" xmlns:w15="http://schemas.microsoft.com/office/word/2012/wordml" xmlns:w16cex="http://schemas.microsoft.com/office/word/2018/wordml/cex" xmlns:w16cid="http://schemas.microsoft.com/office/word/2016/wordml/cid" xmlns:w16="http://schemas.microsoft.com/office/word/2018/wordml" xmlns:w16du="http://schemas.microsoft.com/office/word/2023/wordml/word16du" xmlns:w16sdtdh="http://schemas.microsoft.com/office/word/2020/wordml/sdtdatahash" xmlns:w16sdtfl="http://schemas.microsoft.com/office/word/2024/wordml/sdtformatlock" xmlns:w16se="http://schemas.microsoft.com/office/word/2015/wordml/symex" xmlns:wpg="http://schemas.microsoft.com/office/word/2010/wordprocessingGroup" xmlns:wpi="http://schemas.microsoft.com/office/word/2010/wordprocessingInk" xmlns:wne="http://schemas.microsoft.com/office/word/2006/wordml" xmlns:wps="http://schemas.microsoft.com/office/word/2010/wordprocessingShape" mc:Ignorable="w14 w15 w16se w16cid w16 w16cex w16sdtdh w16sdtfl w16du wp14">
   <w:body>
-    <w:bookmarkStart w:id="13" w:name="X74cea235a841abf447a52319c04385969c99889"/>
     <w:p>
       <w:pPr>
         <w:pStyle w:val="Heading3"/>
       </w:pPr>
-      <w:r>
-        <w:t xml:space="preserve">Paper: Residual Autoencoder with Squeeze-and-Excitation (Model GEN3 05)</w:t>
-      </w:r>
-    </w:p>
-    <w:bookmarkStart w:id="9" w:name="architecture-overview"/>
+      <w:bookmarkStart w:id="0" w:name="X74cea235a841abf447a52319c04385969c99889"/>
+      <w:r>
+        <w:t>Paper: Residual Autoencoder with Squeeze-and-Excitation</w:t>
+      </w:r>
+    </w:p>
     <w:p>
       <w:pPr>
         <w:pStyle w:val="Heading4"/>
       </w:pPr>
-      <w:r>
-        <w:t xml:space="preserve">Architecture Overview</w:t>
+      <w:bookmarkStart w:id="1" w:name="architecture-overview"/>
+      <w:r>
+        <w:t>Architecture Overview</w:t>
       </w:r>
     </w:p>
     <w:p>
@@ -25,22 +25,16 @@
         <w:pStyle w:val="FirstParagraph"/>
       </w:pPr>
       <w:r>
-        <w:t xml:space="preserve">The core of this dimensionality reduction task is the</w:t>
-      </w:r>
-      <w:r>
-        <w:t xml:space="preserve"> </w:t>
+        <w:t xml:space="preserve">The core of this dimensionality reduction task is the </w:t>
       </w:r>
       <w:r>
         <w:rPr>
           <w:rStyle w:val="VerbatimChar"/>
         </w:rPr>
-        <w:t xml:space="preserve">Model_GEN3_05_AttentionSE</w:t>
-      </w:r>
-      <w:r>
-        <w:t xml:space="preserve"> </w:t>
-      </w:r>
-      <w:r>
-        <w:t xml:space="preserve">architecture, a Residual Autoencoder (AE) that incorporates Squeeze-and-Excitation (SE) blocks for enhanced feature recalibration. The model is designed to compress high-dimensional fluid dynamics velocity fields into a compact latent representation while maintaining high reconstruction fidelity.</w:t>
+        <w:t>Model_GEN3_05_AttentionSE</w:t>
+      </w:r>
+      <w:r>
+        <w:t xml:space="preserve"> architecture, a Residual Autoencoder (AE) that incorporates Squeeze-and-Excitation (SE) blocks for enhanced feature recalibration. The model is designed to compress high-dimensional fluid dynamics velocity fields into a compact latent representation while maintaining high reconstruction fidelity.</w:t>
       </w:r>
     </w:p>
     <w:p>
@@ -48,7 +42,7 @@
         <w:pStyle w:val="Compact"/>
         <w:numPr>
           <w:ilvl w:val="0"/>
-          <w:numId w:val="1001"/>
+          <w:numId w:val="2"/>
         </w:numPr>
       </w:pPr>
       <w:r>
@@ -56,10 +50,10 @@
           <w:b/>
           <w:bCs/>
         </w:rPr>
-        <w:t xml:space="preserve">Algorithm</w:t>
-      </w:r>
-      <w:r>
-        <w:t xml:space="preserve">: Residual Autoencoder with Squeeze-and-Excitation (AttentionSE).</w:t>
+        <w:t>Algorithm</w:t>
+      </w:r>
+      <w:r>
+        <w:t>: Residual Autoencoder with Squeeze-and-Excitation (AttentionSE).</w:t>
       </w:r>
     </w:p>
     <w:p>
@@ -67,7 +61,7 @@
         <w:pStyle w:val="Compact"/>
         <w:numPr>
           <w:ilvl w:val="0"/>
-          <w:numId w:val="1001"/>
+          <w:numId w:val="2"/>
         </w:numPr>
       </w:pPr>
       <w:r>
@@ -75,10 +69,10 @@
           <w:b/>
           <w:bCs/>
         </w:rPr>
-        <w:t xml:space="preserve">Compression Strategy</w:t>
-      </w:r>
-      <w:r>
-        <w:t xml:space="preserve">: Hierarchical dimensionality reduction using fully connected layers interspersed with SEResidualBlocks.</w:t>
+        <w:t>Compression Strategy</w:t>
+      </w:r>
+      <w:r>
+        <w:t>: Hierarchical dimensionality reduction using fully connected layers interspersed with SEResidualBlocks.</w:t>
       </w:r>
     </w:p>
     <w:p>
@@ -86,7 +80,7 @@
         <w:pStyle w:val="Compact"/>
         <w:numPr>
           <w:ilvl w:val="0"/>
-          <w:numId w:val="1001"/>
+          <w:numId w:val="2"/>
         </w:numPr>
       </w:pPr>
       <w:r>
@@ -94,10 +88,10 @@
           <w:b/>
           <w:bCs/>
         </w:rPr>
-        <w:t xml:space="preserve">Input Dimension</w:t>
-      </w:r>
-      <w:r>
-        <w:t xml:space="preserve">: 375 floats (representing the flattened velocity field).</w:t>
+        <w:t>Input Dimension</w:t>
+      </w:r>
+      <w:r>
+        <w:t>: 375 floats (representing the flattened velocity field).</w:t>
       </w:r>
     </w:p>
     <w:p>
@@ -105,7 +99,7 @@
         <w:pStyle w:val="Compact"/>
         <w:numPr>
           <w:ilvl w:val="0"/>
-          <w:numId w:val="1001"/>
+          <w:numId w:val="2"/>
         </w:numPr>
       </w:pPr>
       <w:r>
@@ -113,10 +107,10 @@
           <w:b/>
           <w:bCs/>
         </w:rPr>
-        <w:t xml:space="preserve">Latent Dimension</w:t>
-      </w:r>
-      <w:r>
-        <w:t xml:space="preserve">: 47 floats.</w:t>
+        <w:t>Latent Dimension</w:t>
+      </w:r>
+      <w:r>
+        <w:t>: 47 floats.</w:t>
       </w:r>
     </w:p>
     <w:p>
@@ -124,7 +118,7 @@
         <w:pStyle w:val="Compact"/>
         <w:numPr>
           <w:ilvl w:val="0"/>
-          <w:numId w:val="1001"/>
+          <w:numId w:val="2"/>
         </w:numPr>
       </w:pPr>
       <w:r>
@@ -132,10 +126,10 @@
           <w:b/>
           <w:bCs/>
         </w:rPr>
-        <w:t xml:space="preserve">Compression Ratio</w:t>
-      </w:r>
-      <w:r>
-        <w:t xml:space="preserve">: 87.5% (approx. 1:8 compression).</w:t>
+        <w:t>Compression Ratio</w:t>
+      </w:r>
+      <w:r>
+        <w:t>: 87.5% (approx. 1:8 compression).</w:t>
       </w:r>
     </w:p>
     <w:p>
@@ -143,7 +137,7 @@
         <w:pStyle w:val="Compact"/>
         <w:numPr>
           <w:ilvl w:val="0"/>
-          <w:numId w:val="1001"/>
+          <w:numId w:val="2"/>
         </w:numPr>
       </w:pPr>
       <w:r>
@@ -151,10 +145,10 @@
           <w:b/>
           <w:bCs/>
         </w:rPr>
-        <w:t xml:space="preserve">Activation Functions</w:t>
-      </w:r>
-      <w:r>
-        <w:t xml:space="preserve">:</w:t>
+        <w:t>Activation Functions</w:t>
+      </w:r>
+      <w:r>
+        <w:t>:</w:t>
       </w:r>
     </w:p>
     <w:p>
@@ -162,7 +156,7 @@
         <w:pStyle w:val="Compact"/>
         <w:numPr>
           <w:ilvl w:val="1"/>
-          <w:numId w:val="1002"/>
+          <w:numId w:val="3"/>
         </w:numPr>
       </w:pPr>
       <w:r>
@@ -170,13 +164,10 @@
           <w:b/>
           <w:bCs/>
         </w:rPr>
-        <w:t xml:space="preserve">ELU (Exponential Linear Unit)</w:t>
-      </w:r>
-      <w:r>
-        <w:t xml:space="preserve"> </w:t>
-      </w:r>
-      <w:r>
-        <w:t xml:space="preserve">for intermediate layers to maintain gradient flow.</w:t>
+        <w:t>ELU (Exponential Linear Unit)</w:t>
+      </w:r>
+      <w:r>
+        <w:t xml:space="preserve"> for intermediate layers to maintain gradient flow.</w:t>
       </w:r>
     </w:p>
     <w:p>
@@ -184,7 +175,7 @@
         <w:pStyle w:val="Compact"/>
         <w:numPr>
           <w:ilvl w:val="1"/>
-          <w:numId w:val="1002"/>
+          <w:numId w:val="3"/>
         </w:numPr>
       </w:pPr>
       <w:r>
@@ -192,13 +183,10 @@
           <w:b/>
           <w:bCs/>
         </w:rPr>
-        <w:t xml:space="preserve">Tanh</w:t>
-      </w:r>
-      <w:r>
-        <w:t xml:space="preserve"> </w:t>
-      </w:r>
-      <w:r>
-        <w:t xml:space="preserve">at the bottleneck to bound the latent space to [-1, 1].</w:t>
+        <w:t>Tanh</w:t>
+      </w:r>
+      <w:r>
+        <w:t xml:space="preserve"> at the bottleneck to bound the latent space to [-1, 1].</w:t>
       </w:r>
     </w:p>
     <w:p>
@@ -206,7 +194,7 @@
         <w:pStyle w:val="Compact"/>
         <w:numPr>
           <w:ilvl w:val="1"/>
-          <w:numId w:val="1002"/>
+          <w:numId w:val="3"/>
         </w:numPr>
       </w:pPr>
       <w:r>
@@ -214,23 +202,20 @@
           <w:b/>
           <w:bCs/>
         </w:rPr>
-        <w:t xml:space="preserve">Linear</w:t>
-      </w:r>
-      <w:r>
-        <w:t xml:space="preserve"> </w:t>
-      </w:r>
-      <w:r>
-        <w:t xml:space="preserve">(no activation) at the output to allow for the full range of physical velocity values.</w:t>
-      </w:r>
-    </w:p>
-    <w:bookmarkEnd w:id="9"/>
-    <w:bookmarkStart w:id="10" w:name="key-architectural-components"/>
+        <w:t>Linear</w:t>
+      </w:r>
+      <w:r>
+        <w:t xml:space="preserve"> (no activation) at the output to allow for the full range of physical velocity values.</w:t>
+      </w:r>
+    </w:p>
     <w:p>
       <w:pPr>
         <w:pStyle w:val="Heading4"/>
       </w:pPr>
-      <w:r>
-        <w:t xml:space="preserve">Key Architectural Components</w:t>
+      <w:bookmarkStart w:id="2" w:name="key-architectural-components"/>
+      <w:bookmarkEnd w:id="1"/>
+      <w:r>
+        <w:t>Key Architectural Components</w:t>
       </w:r>
     </w:p>
     <w:p>
@@ -238,7 +223,7 @@
         <w:pStyle w:val="Compact"/>
         <w:numPr>
           <w:ilvl w:val="0"/>
-          <w:numId w:val="1003"/>
+          <w:numId w:val="4"/>
         </w:numPr>
       </w:pPr>
       <w:r>
@@ -246,10 +231,10 @@
           <w:b/>
           <w:bCs/>
         </w:rPr>
-        <w:t xml:space="preserve">Residual Connections</w:t>
-      </w:r>
-      <w:r>
-        <w:t xml:space="preserve">: Each stage of the encoder and decoder utilizes skip connections to facilitate gradient flow and allow the network to learn incremental refinements at multiple scales.</w:t>
+        <w:t>Residual Connections</w:t>
+      </w:r>
+      <w:r>
+        <w:t>: Each stage of the encoder and decoder utilizes skip connections to facilitate gradient flow and allow the network to learn incremental refinements at multiple scales.</w:t>
       </w:r>
     </w:p>
     <w:p>
@@ -257,7 +242,7 @@
         <w:pStyle w:val="Compact"/>
         <w:numPr>
           <w:ilvl w:val="0"/>
-          <w:numId w:val="1003"/>
+          <w:numId w:val="4"/>
         </w:numPr>
       </w:pPr>
       <w:r>
@@ -265,22 +250,10 @@
           <w:b/>
           <w:bCs/>
         </w:rPr>
-        <w:t xml:space="preserve">Squeeze-and-Excitation (SE) Blocks</w:t>
-      </w:r>
-      <w:r>
-        <w:t xml:space="preserve">: Integrated within the residual blocks, these components recalibrate feature importance by modeling inter-dependencies between</w:t>
-      </w:r>
-      <w:r>
-        <w:t xml:space="preserve"> </w:t>
-      </w:r>
-      <w:r>
-        <w:t xml:space="preserve">“channels”</w:t>
-      </w:r>
-      <w:r>
-        <w:t xml:space="preserve"> </w:t>
-      </w:r>
-      <w:r>
-        <w:t xml:space="preserve">(features). This allows the model to focus on the most energetically significant flow structures.</w:t>
+        <w:t>Squeeze-and-Excitation (SE) Blocks</w:t>
+      </w:r>
+      <w:r>
+        <w:t>: Integrated within the residual blocks, these components recalibrate feature importance by modeling inter-dependencies between “channels” (features). This allows the model to focus on the most energetically significant flow structures.</w:t>
       </w:r>
     </w:p>
     <w:p>
@@ -288,7 +261,7 @@
         <w:pStyle w:val="Compact"/>
         <w:numPr>
           <w:ilvl w:val="0"/>
-          <w:numId w:val="1003"/>
+          <w:numId w:val="4"/>
         </w:numPr>
       </w:pPr>
       <w:r>
@@ -296,20 +269,20 @@
           <w:b/>
           <w:bCs/>
         </w:rPr>
-        <w:t xml:space="preserve">Layer Normalization</w:t>
-      </w:r>
-      <w:r>
-        <w:t xml:space="preserve">: Applied within each residual block to stabilize training and improve convergence.</w:t>
-      </w:r>
-    </w:p>
-    <w:bookmarkEnd w:id="10"/>
-    <w:bookmarkStart w:id="11" w:name="training-and-data-sampling"/>
+        <w:t>Layer Normalization</w:t>
+      </w:r>
+      <w:r>
+        <w:t>: Applied within each residual block to stabilize training and improve convergence.</w:t>
+      </w:r>
+    </w:p>
     <w:p>
       <w:pPr>
         <w:pStyle w:val="Heading4"/>
       </w:pPr>
-      <w:r>
-        <w:t xml:space="preserve">Training and Data Sampling</w:t>
+      <w:bookmarkStart w:id="3" w:name="training-and-data-sampling"/>
+      <w:bookmarkEnd w:id="2"/>
+      <w:r>
+        <w:t>Training and Data Sampling</w:t>
       </w:r>
     </w:p>
     <w:p>
@@ -317,7 +290,7 @@
         <w:pStyle w:val="FirstParagraph"/>
       </w:pPr>
       <w:r>
-        <w:t xml:space="preserve">The model was trained using a large-scale dataset sampled to ensure robustness across various flow conditions.</w:t>
+        <w:t>The model was trained using a large-scale dataset sampled to ensure robustness across various flow conditions.</w:t>
       </w:r>
     </w:p>
     <w:p>
@@ -325,7 +298,7 @@
         <w:pStyle w:val="Compact"/>
         <w:numPr>
           <w:ilvl w:val="0"/>
-          <w:numId w:val="1004"/>
+          <w:numId w:val="5"/>
         </w:numPr>
       </w:pPr>
       <w:r>
@@ -333,10 +306,10 @@
           <w:b/>
           <w:bCs/>
         </w:rPr>
-        <w:t xml:space="preserve">Data Sampling Strategy</w:t>
-      </w:r>
-      <w:r>
-        <w:t xml:space="preserve">:</w:t>
+        <w:t>Data Sampling Strategy</w:t>
+      </w:r>
+      <w:r>
+        <w:t>:</w:t>
       </w:r>
     </w:p>
     <w:p>
@@ -344,23 +317,20 @@
         <w:pStyle w:val="Compact"/>
         <w:numPr>
           <w:ilvl w:val="1"/>
-          <w:numId w:val="1005"/>
+          <w:numId w:val="6"/>
         </w:numPr>
       </w:pPr>
       <w:r>
-        <w:t xml:space="preserve">Training and validation datasets were built by sampling rows uniformly at random from a large pool of existing data files (stored as</w:t>
-      </w:r>
-      <w:r>
-        <w:t xml:space="preserve"> </w:t>
+        <w:t xml:space="preserve">Training and validation datasets were built by sampling rows uniformly at random from a large pool of existing data files (stored as </w:t>
       </w:r>
       <w:r>
         <w:rPr>
           <w:rStyle w:val="VerbatimChar"/>
         </w:rPr>
-        <w:t xml:space="preserve">.pkl.gz</w:t>
-      </w:r>
-      <w:r>
-        <w:t xml:space="preserve">).</w:t>
+        <w:t>.pkl.gz</w:t>
+      </w:r>
+      <w:r>
+        <w:t>).</w:t>
       </w:r>
     </w:p>
     <w:p>
@@ -368,58 +338,40 @@
         <w:pStyle w:val="Compact"/>
         <w:numPr>
           <w:ilvl w:val="1"/>
-          <w:numId w:val="1005"/>
+          <w:numId w:val="6"/>
         </w:numPr>
       </w:pPr>
       <w:r>
-        <w:t xml:space="preserve">The</w:t>
-      </w:r>
-      <w:r>
-        <w:t xml:space="preserve"> </w:t>
+        <w:t xml:space="preserve">The </w:t>
       </w:r>
       <w:r>
         <w:rPr>
           <w:rStyle w:val="VerbatimChar"/>
         </w:rPr>
-        <w:t xml:space="preserve">EfficientDataLoader</w:t>
-      </w:r>
-      <w:r>
-        <w:t xml:space="preserve"> </w:t>
-      </w:r>
-      <w:r>
-        <w:t xml:space="preserve">was utilized to perform this sampling without being IO-bound, drawing a default of</w:t>
-      </w:r>
-      <w:r>
-        <w:t xml:space="preserve"> </w:t>
+        <w:t>EfficientDataLoader</w:t>
+      </w:r>
+      <w:r>
+        <w:t xml:space="preserve"> was utilized to perform this sampling without being IO-bound, drawing a default of </w:t>
       </w:r>
       <w:r>
         <w:rPr>
           <w:b/>
           <w:bCs/>
         </w:rPr>
-        <w:t xml:space="preserve">2,000,000 rows</w:t>
-      </w:r>
-      <w:r>
-        <w:t xml:space="preserve"> </w:t>
-      </w:r>
-      <w:r>
-        <w:t xml:space="preserve">for the training set and</w:t>
-      </w:r>
-      <w:r>
-        <w:t xml:space="preserve"> </w:t>
+        <w:t>2,000,000 rows</w:t>
+      </w:r>
+      <w:r>
+        <w:t xml:space="preserve"> for the training set and </w:t>
       </w:r>
       <w:r>
         <w:rPr>
           <w:b/>
           <w:bCs/>
         </w:rPr>
-        <w:t xml:space="preserve">2,000,000 rows</w:t>
-      </w:r>
-      <w:r>
-        <w:t xml:space="preserve"> </w:t>
-      </w:r>
-      <w:r>
-        <w:t xml:space="preserve">for the validation set.</w:t>
+        <w:t>2,000,000 rows</w:t>
+      </w:r>
+      <w:r>
+        <w:t xml:space="preserve"> for the validation set.</w:t>
       </w:r>
     </w:p>
     <w:p>
@@ -427,11 +379,12 @@
         <w:pStyle w:val="Compact"/>
         <w:numPr>
           <w:ilvl w:val="1"/>
-          <w:numId w:val="1005"/>
+          <w:numId w:val="6"/>
         </w:numPr>
       </w:pPr>
       <w:r>
-        <w:t xml:space="preserve">This approach ensures that both sets are representative of the global flow manifold.</w:t>
+        <w:lastRenderedPageBreak/>
+        <w:t>This approach ensures that both sets are representative of the global flow manifold.</w:t>
       </w:r>
     </w:p>
     <w:p>
@@ -439,7 +392,7 @@
         <w:pStyle w:val="Compact"/>
         <w:numPr>
           <w:ilvl w:val="0"/>
-          <w:numId w:val="1004"/>
+          <w:numId w:val="5"/>
         </w:numPr>
       </w:pPr>
       <w:r>
@@ -447,22 +400,19 @@
           <w:b/>
           <w:bCs/>
         </w:rPr>
-        <w:t xml:space="preserve">Optimizer</w:t>
-      </w:r>
-      <w:r>
-        <w:t xml:space="preserve">: Adam optimizer with a learning rate of</w:t>
-      </w:r>
-      <w:r>
-        <w:t xml:space="preserve"> </w:t>
+        <w:t>Optimizer</w:t>
+      </w:r>
+      <w:r>
+        <w:t xml:space="preserve">: Adam optimizer with a learning rate of </w:t>
       </w:r>
       <w:r>
         <w:rPr>
           <w:rStyle w:val="VerbatimChar"/>
         </w:rPr>
-        <w:t xml:space="preserve">1e-4</w:t>
-      </w:r>
-      <w:r>
-        <w:t xml:space="preserve">.</w:t>
+        <w:t>1e-4</w:t>
+      </w:r>
+      <w:r>
+        <w:t>.</w:t>
       </w:r>
     </w:p>
     <w:p>
@@ -470,7 +420,7 @@
         <w:pStyle w:val="Compact"/>
         <w:numPr>
           <w:ilvl w:val="0"/>
-          <w:numId w:val="1004"/>
+          <w:numId w:val="5"/>
         </w:numPr>
       </w:pPr>
       <w:r>
@@ -478,10 +428,10 @@
           <w:b/>
           <w:bCs/>
         </w:rPr>
-        <w:t xml:space="preserve">Batch Size</w:t>
-      </w:r>
-      <w:r>
-        <w:t xml:space="preserve">: 4096.</w:t>
+        <w:t>Batch Size</w:t>
+      </w:r>
+      <w:r>
+        <w:t>: 4096.</w:t>
       </w:r>
     </w:p>
     <w:p>
@@ -489,7 +439,7 @@
         <w:pStyle w:val="Compact"/>
         <w:numPr>
           <w:ilvl w:val="0"/>
-          <w:numId w:val="1004"/>
+          <w:numId w:val="5"/>
         </w:numPr>
       </w:pPr>
       <w:r>
@@ -497,10 +447,10 @@
           <w:b/>
           <w:bCs/>
         </w:rPr>
-        <w:t xml:space="preserve">Epochs</w:t>
-      </w:r>
-      <w:r>
-        <w:t xml:space="preserve">: 1000.</w:t>
+        <w:t>Epochs</w:t>
+      </w:r>
+      <w:r>
+        <w:t>: 1000.</w:t>
       </w:r>
     </w:p>
     <w:p>
@@ -508,7 +458,7 @@
         <w:pStyle w:val="Compact"/>
         <w:numPr>
           <w:ilvl w:val="0"/>
-          <w:numId w:val="1004"/>
+          <w:numId w:val="5"/>
         </w:numPr>
       </w:pPr>
       <w:r>
@@ -516,10 +466,10 @@
           <w:b/>
           <w:bCs/>
         </w:rPr>
-        <w:t xml:space="preserve">Loss Function</w:t>
-      </w:r>
-      <w:r>
-        <w:t xml:space="preserve">:</w:t>
+        <w:t>Loss Function</w:t>
+      </w:r>
+      <w:r>
+        <w:t>:</w:t>
       </w:r>
     </w:p>
     <w:p>
@@ -527,7 +477,7 @@
         <w:pStyle w:val="Compact"/>
         <w:numPr>
           <w:ilvl w:val="1"/>
-          <w:numId w:val="1006"/>
+          <w:numId w:val="7"/>
         </w:numPr>
       </w:pPr>
       <w:r>
@@ -535,10 +485,10 @@
           <w:b/>
           <w:bCs/>
         </w:rPr>
-        <w:t xml:space="preserve">Primary Loss</w:t>
-      </w:r>
-      <w:r>
-        <w:t xml:space="preserve">: Mean Squared Error (MSE) between the input and reconstructed velocity fields.</w:t>
+        <w:t>Primary Loss</w:t>
+      </w:r>
+      <w:r>
+        <w:t>: Mean Squared Error (MSE) between the input and reconstructed velocity fields.</w:t>
       </w:r>
     </w:p>
     <w:p>
@@ -546,7 +496,7 @@
         <w:pStyle w:val="Compact"/>
         <w:numPr>
           <w:ilvl w:val="1"/>
-          <w:numId w:val="1006"/>
+          <w:numId w:val="7"/>
         </w:numPr>
       </w:pPr>
       <w:r>
@@ -554,118 +504,49 @@
           <w:b/>
           <w:bCs/>
         </w:rPr>
-        <w:t xml:space="preserve">Regularization</w:t>
-      </w:r>
-      <w:r>
-        <w:t xml:space="preserve">: A very weak L2 regularization ($</w:t>
-      </w:r>
-      <w:r>
-        <w:t xml:space="preserve"> </w:t>
-      </w:r>
-      <w:r>
-        <w:t xml:space="preserve">= 0.00005</w:t>
-      </w:r>
-      <w:r>
-        <w:t xml:space="preserve"> </w:t>
+        <w:t>Regularization</w:t>
+      </w:r>
+      <w:r>
+        <w:t xml:space="preserve">: A very weak L2 regularization ($ = 0.00005 </w:t>
       </w:r>
       <m:oMath>
         <m:r>
           <m:rPr>
             <m:sty m:val="p"/>
           </m:rPr>
+          <w:rPr>
+            <w:rFonts w:ascii="Cambria Math" w:hAnsi="Cambria Math"/>
+          </w:rPr>
           <m:t>)</m:t>
         </m:r>
         <m:r>
-          <m:t>a</m:t>
-        </m:r>
-        <m:r>
-          <m:t>p</m:t>
-        </m:r>
-        <m:r>
-          <m:t>p</m:t>
-        </m:r>
-        <m:r>
-          <m:t>l</m:t>
-        </m:r>
-        <m:r>
-          <m:t>i</m:t>
-        </m:r>
-        <m:r>
-          <m:t>e</m:t>
-        </m:r>
-        <m:r>
-          <m:t>d</m:t>
-        </m:r>
-        <m:r>
-          <m:t>t</m:t>
-        </m:r>
-        <m:r>
-          <m:t>o</m:t>
-        </m:r>
-        <m:r>
-          <m:t>t</m:t>
-        </m:r>
-        <m:r>
-          <m:t>h</m:t>
-        </m:r>
-        <m:r>
-          <m:t>e</m:t>
-        </m:r>
-        <m:r>
-          <m:t>l</m:t>
-        </m:r>
-        <m:r>
-          <m:t>a</m:t>
-        </m:r>
-        <m:r>
-          <m:t>t</m:t>
-        </m:r>
-        <m:r>
-          <m:t>e</m:t>
-        </m:r>
-        <m:r>
-          <m:t>n</m:t>
-        </m:r>
-        <m:r>
-          <m:t>t</m:t>
-        </m:r>
-        <m:r>
-          <m:t>s</m:t>
-        </m:r>
-        <m:r>
-          <m:t>p</m:t>
-        </m:r>
-        <m:r>
-          <m:t>a</m:t>
-        </m:r>
-        <m:r>
-          <m:t>c</m:t>
-        </m:r>
-        <m:r>
-          <m:t>e</m:t>
+          <w:rPr>
+            <w:rFonts w:ascii="Cambria Math" w:hAnsi="Cambria Math"/>
+          </w:rPr>
+          <m:t>appliedtothelatentspace</m:t>
         </m:r>
         <m:r>
           <m:rPr>
             <m:sty m:val="p"/>
           </m:rPr>
+          <w:rPr>
+            <w:rFonts w:ascii="Cambria Math" w:hAnsi="Cambria Math"/>
+          </w:rPr>
           <m:t>(</m:t>
         </m:r>
       </m:oMath>
       <w:r>
-        <w:t xml:space="preserve"> </w:t>
-      </w:r>
-      <w:r>
-        <w:t xml:space="preserve">|z|^2 $) to prevent latent code explosion without sacrificing reconstruction accuracy.</w:t>
-      </w:r>
-    </w:p>
-    <w:bookmarkEnd w:id="11"/>
-    <w:bookmarkStart w:id="12" w:name="performance-metrics"/>
+        <w:t xml:space="preserve"> |z|^2 $) to prevent latent code explosion without sacrificing reconstruction accuracy.</w:t>
+      </w:r>
+    </w:p>
     <w:p>
       <w:pPr>
         <w:pStyle w:val="Heading4"/>
       </w:pPr>
-      <w:r>
-        <w:t xml:space="preserve">Performance Metrics</w:t>
+      <w:bookmarkStart w:id="4" w:name="performance-metrics"/>
+      <w:bookmarkEnd w:id="3"/>
+      <w:r>
+        <w:t>Performance Metrics</w:t>
       </w:r>
     </w:p>
     <w:p>
@@ -673,7 +554,7 @@
         <w:pStyle w:val="FirstParagraph"/>
       </w:pPr>
       <w:r>
-        <w:t xml:space="preserve">The model achieved exceptional reconstruction accuracy, as evidenced by the Root Mean Squared Error (RMSE) across the validation sample.</w:t>
+        <w:t>The model achieved exceptional reconstruction accuracy, as evidenced by the Root Mean Squared Error (RMSE) across the validation sample.</w:t>
       </w:r>
     </w:p>
     <w:p>
@@ -681,7 +562,7 @@
         <w:pStyle w:val="Compact"/>
         <w:numPr>
           <w:ilvl w:val="0"/>
-          <w:numId w:val="1007"/>
+          <w:numId w:val="8"/>
         </w:numPr>
       </w:pPr>
       <w:r>
@@ -689,10 +570,10 @@
           <w:b/>
           <w:bCs/>
         </w:rPr>
-        <w:t xml:space="preserve">Final Validation RMSE (Normalized)</w:t>
-      </w:r>
-      <w:r>
-        <w:t xml:space="preserve">: ~0.00077 (Global average across files).</w:t>
+        <w:t>Final Validation RMSE (Normalized)</w:t>
+      </w:r>
+      <w:r>
+        <w:t>: ~0.00077 (Global average across files).</w:t>
       </w:r>
     </w:p>
     <w:p>
@@ -700,7 +581,7 @@
         <w:pStyle w:val="Compact"/>
         <w:numPr>
           <w:ilvl w:val="0"/>
-          <w:numId w:val="1007"/>
+          <w:numId w:val="8"/>
         </w:numPr>
       </w:pPr>
       <w:r>
@@ -708,10 +589,10 @@
           <w:b/>
           <w:bCs/>
         </w:rPr>
-        <w:t xml:space="preserve">Final Validation RMSE (Raw Units)</w:t>
-      </w:r>
-      <w:r>
-        <w:t xml:space="preserve">: ~0.00036 (Global average across files).</w:t>
+        <w:t>Final Validation RMSE (Raw Units)</w:t>
+      </w:r>
+      <w:r>
+        <w:t>: ~0.00036 (Global average across files).</w:t>
       </w:r>
     </w:p>
     <w:p>
@@ -719,7 +600,7 @@
         <w:pStyle w:val="Compact"/>
         <w:numPr>
           <w:ilvl w:val="0"/>
-          <w:numId w:val="1007"/>
+          <w:numId w:val="8"/>
         </w:numPr>
       </w:pPr>
       <w:r>
@@ -727,63 +608,171 @@
           <w:b/>
           <w:bCs/>
         </w:rPr>
-        <w:t xml:space="preserve">Peak Performance</w:t>
-      </w:r>
-      <w:r>
-        <w:t xml:space="preserve">: The</w:t>
-      </w:r>
-      <w:r>
-        <w:t xml:space="preserve"> </w:t>
-      </w:r>
-      <w:r>
-        <w:t xml:space="preserve">“AttentionSE”</w:t>
-      </w:r>
-      <w:r>
-        <w:t xml:space="preserve"> </w:t>
-      </w:r>
-      <w:r>
-        <w:t xml:space="preserve">model was identified as the winning architecture due to its superior ability to maintain performance as data variability increased, outperforming standard baseline residual models.</w:t>
-      </w:r>
-    </w:p>
-    <w:bookmarkEnd w:id="12"/>
-    <w:bookmarkEnd w:id="13"/>
+        <w:t>Peak Performance</w:t>
+      </w:r>
+      <w:r>
+        <w:t>: The “AttentionSE” model was identified as the winning architecture due to its superior ability to maintain performance as data variability increased, outperforming standard baseline residual models.</w:t>
+      </w:r>
+      <w:r>
+        <w:rPr>
+          <w:noProof/>
+        </w:rPr>
+        <w:lastRenderedPageBreak/>
+        <w:drawing>
+          <wp:inline distT="0" distB="0" distL="0" distR="0" wp14:anchorId="0BFEBB42" wp14:editId="6EEFA387">
+            <wp:extent cx="5943600" cy="6657340"/>
+            <wp:effectExtent l="0" t="0" r="0" b="0"/>
+            <wp:docPr id="962626635" name="Picture 1" descr="A diagram of a rectangular box&#10;&#10;AI-generated content may be incorrect."/>
+            <wp:cNvGraphicFramePr>
+              <a:graphicFrameLocks xmlns:a="http://schemas.openxmlformats.org/drawingml/2006/main" noChangeAspect="1"/>
+            </wp:cNvGraphicFramePr>
+            <a:graphic xmlns:a="http://schemas.openxmlformats.org/drawingml/2006/main">
+              <a:graphicData uri="http://schemas.openxmlformats.org/drawingml/2006/picture">
+                <pic:pic xmlns:pic="http://schemas.openxmlformats.org/drawingml/2006/picture">
+                  <pic:nvPicPr>
+                    <pic:cNvPr id="962626635" name="Picture 1" descr="A diagram of a rectangular box&#10;&#10;AI-generated content may be incorrect."/>
+                    <pic:cNvPicPr/>
+                  </pic:nvPicPr>
+                  <pic:blipFill>
+                    <a:blip r:embed="rId5" cstate="print">
+                      <a:extLst>
+                        <a:ext uri="{28A0092B-C50C-407E-A947-70E740481C1C}">
+                          <a14:useLocalDpi xmlns:a14="http://schemas.microsoft.com/office/drawing/2010/main" val="0"/>
+                        </a:ext>
+                      </a:extLst>
+                    </a:blip>
+                    <a:stretch>
+                      <a:fillRect/>
+                    </a:stretch>
+                  </pic:blipFill>
+                  <pic:spPr>
+                    <a:xfrm>
+                      <a:off x="0" y="0"/>
+                      <a:ext cx="5943600" cy="6657340"/>
+                    </a:xfrm>
+                    <a:prstGeom prst="rect">
+                      <a:avLst/>
+                    </a:prstGeom>
+                  </pic:spPr>
+                </pic:pic>
+              </a:graphicData>
+            </a:graphic>
+          </wp:inline>
+        </w:drawing>
+      </w:r>
+      <w:r>
+        <w:rPr>
+          <w:noProof/>
+        </w:rPr>
+        <w:lastRenderedPageBreak/>
+        <w:drawing>
+          <wp:inline distT="0" distB="0" distL="0" distR="0" wp14:anchorId="6E9158A3" wp14:editId="59CED5DF">
+            <wp:extent cx="5943600" cy="6232525"/>
+            <wp:effectExtent l="0" t="0" r="0" b="0"/>
+            <wp:docPr id="938607643" name="Picture 2" descr="A graph of a graph&#10;&#10;AI-generated content may be incorrect."/>
+            <wp:cNvGraphicFramePr>
+              <a:graphicFrameLocks xmlns:a="http://schemas.openxmlformats.org/drawingml/2006/main" noChangeAspect="1"/>
+            </wp:cNvGraphicFramePr>
+            <a:graphic xmlns:a="http://schemas.openxmlformats.org/drawingml/2006/main">
+              <a:graphicData uri="http://schemas.openxmlformats.org/drawingml/2006/picture">
+                <pic:pic xmlns:pic="http://schemas.openxmlformats.org/drawingml/2006/picture">
+                  <pic:nvPicPr>
+                    <pic:cNvPr id="938607643" name="Picture 2" descr="A graph of a graph&#10;&#10;AI-generated content may be incorrect."/>
+                    <pic:cNvPicPr/>
+                  </pic:nvPicPr>
+                  <pic:blipFill>
+                    <a:blip r:embed="rId6" cstate="print">
+                      <a:extLst>
+                        <a:ext uri="{28A0092B-C50C-407E-A947-70E740481C1C}">
+                          <a14:useLocalDpi xmlns:a14="http://schemas.microsoft.com/office/drawing/2010/main" val="0"/>
+                        </a:ext>
+                      </a:extLst>
+                    </a:blip>
+                    <a:stretch>
+                      <a:fillRect/>
+                    </a:stretch>
+                  </pic:blipFill>
+                  <pic:spPr>
+                    <a:xfrm>
+                      <a:off x="0" y="0"/>
+                      <a:ext cx="5943600" cy="6232525"/>
+                    </a:xfrm>
+                    <a:prstGeom prst="rect">
+                      <a:avLst/>
+                    </a:prstGeom>
+                  </pic:spPr>
+                </pic:pic>
+              </a:graphicData>
+            </a:graphic>
+          </wp:inline>
+        </w:drawing>
+      </w:r>
+    </w:p>
+    <w:p>
+      <w:pPr>
+        <w:pStyle w:val="Compact"/>
+      </w:pPr>
+    </w:p>
+    <w:p>
+      <w:pPr>
+        <w:pStyle w:val="Compact"/>
+      </w:pPr>
+    </w:p>
+    <w:p>
+      <w:pPr>
+        <w:pStyle w:val="Compact"/>
+      </w:pPr>
+    </w:p>
+    <w:p>
+      <w:pPr>
+        <w:pStyle w:val="Compact"/>
+      </w:pPr>
+    </w:p>
+    <w:p>
+      <w:pPr>
+        <w:pStyle w:val="Compact"/>
+      </w:pPr>
+    </w:p>
+    <w:p>
+      <w:pPr>
+        <w:pStyle w:val="Compact"/>
+      </w:pPr>
+    </w:p>
+    <w:p>
+      <w:pPr>
+        <w:pStyle w:val="Compact"/>
+      </w:pPr>
+    </w:p>
+    <w:p>
+      <w:r>
+        <w:br w:type="page"/>
+      </w:r>
+    </w:p>
+    <w:bookmarkEnd w:id="0"/>
+    <w:bookmarkEnd w:id="4"/>
+    <w:p>
+      <w:pPr>
+        <w:pStyle w:val="Compact"/>
+      </w:pPr>
+    </w:p>
     <w:sectPr>
       <w:footnotePr>
         <w:numRestart w:val="eachSect"/>
       </w:footnotePr>
+      <w:pgSz w:w="12240" w:h="15840"/>
+      <w:pgMar w:top="1440" w:right="1440" w:bottom="1440" w:left="1440" w:header="720" w:footer="720" w:gutter="0"/>
+      <w:cols w:space="720"/>
     </w:sectPr>
   </w:body>
 </w:document>
 </file>
 
-<file path=word/comments.xml><?xml version="1.0" encoding="utf-8"?>
-<w:comments xmlns:w="http://schemas.openxmlformats.org/wordprocessingml/2006/main" xmlns:m="http://schemas.openxmlformats.org/officeDocument/2006/math" xmlns:r="http://schemas.openxmlformats.org/officeDocument/2006/relationships" xmlns:o="urn:schemas-microsoft-com:office:office" xmlns:v="urn:schemas-microsoft-com:vml" xmlns:w10="urn:schemas-microsoft-com:office:word" xmlns:a="http://schemas.openxmlformats.org/drawingml/2006/main" xmlns:pic="http://schemas.openxmlformats.org/drawingml/2006/picture" xmlns:wp="http://schemas.openxmlformats.org/drawingml/2006/wordprocessingDrawing"/>
-</file>
-
-<file path=word/footnotes.xml><?xml version="1.0" encoding="utf-8"?>
-<w:footnotes xmlns:w="http://schemas.openxmlformats.org/wordprocessingml/2006/main" xmlns:m="http://schemas.openxmlformats.org/officeDocument/2006/math" xmlns:r="http://schemas.openxmlformats.org/officeDocument/2006/relationships" xmlns:o="urn:schemas-microsoft-com:office:office" xmlns:v="urn:schemas-microsoft-com:vml" xmlns:w10="urn:schemas-microsoft-com:office:word" xmlns:a="http://schemas.openxmlformats.org/drawingml/2006/main" xmlns:pic="http://schemas.openxmlformats.org/drawingml/2006/picture" xmlns:wp="http://schemas.openxmlformats.org/drawingml/2006/wordprocessingDrawing">
-  <w:footnote w:type="continuationSeparator" w:id="0">
-    <w:p>
-      <w:r>
-        <w:continuationSeparator/>
-      </w:r>
-    </w:p>
-  </w:footnote>
-  <w:footnote w:type="separator" w:id="-1">
-    <w:p>
-      <w:r>
-        <w:separator/>
-      </w:r>
-    </w:p>
-  </w:footnote>
-</w:footnotes>
-</file>
-
 <file path=word/numbering.xml><?xml version="1.0" encoding="utf-8"?>
-<w:numbering xmlns:w="http://schemas.openxmlformats.org/wordprocessingml/2006/main">
-  <w:abstractNum w:abstractNumId="990">
+<w:numbering xmlns:wpc="http://schemas.microsoft.com/office/word/2010/wordprocessingCanvas" xmlns:cx="http://schemas.microsoft.com/office/drawing/2014/chartex" xmlns:cx1="http://schemas.microsoft.com/office/drawing/2015/9/8/chartex" xmlns:cx2="http://schemas.microsoft.com/office/drawing/2015/10/21/chartex" xmlns:cx3="http://schemas.microsoft.com/office/drawing/2016/5/9/chartex" xmlns:cx4="http://schemas.microsoft.com/office/drawing/2016/5/10/chartex" xmlns:cx5="http://schemas.microsoft.com/office/drawing/2016/5/11/chartex" xmlns:cx6="http://schemas.microsoft.com/office/drawing/2016/5/12/chartex" xmlns:cx7="http://schemas.microsoft.com/office/drawing/2016/5/13/chartex" xmlns:cx8="http://schemas.microsoft.com/office/drawing/2016/5/14/chartex" xmlns:mc="http://schemas.openxmlformats.org/markup-compatibility/2006" xmlns:aink="http://schemas.microsoft.com/office/drawing/2016/ink" xmlns:am3d="http://schemas.microsoft.com/office/drawing/2017/model3d" xmlns:o="urn:schemas-microsoft-com:office:office" xmlns:oel="http://schemas.microsoft.com/office/2019/extlst" xmlns:r="http://schemas.openxmlformats.org/officeDocument/2006/relationships" xmlns:m="http://schemas.openxmlformats.org/officeDocument/2006/math" xmlns:v="urn:schemas-microsoft-com:vml" xmlns:wp14="http://schemas.microsoft.com/office/word/2010/wordprocessingDrawing" xmlns:wp="http://schemas.openxmlformats.org/drawingml/2006/wordprocessingDrawing" xmlns:w10="urn:schemas-microsoft-com:office:word" xmlns:w="http://schemas.openxmlformats.org/wordprocessingml/2006/main" xmlns:w14="http://schemas.microsoft.com/office/word/2010/wordml" xmlns:w15="http://schemas.microsoft.com/office/word/2012/wordml" xmlns:w16cex="http://schemas.microsoft.com/office/word/2018/wordml/cex" xmlns:w16cid="http://schemas.microsoft.com/office/word/2016/wordml/cid" xmlns:w16="http://schemas.microsoft.com/office/word/2018/wordml" xmlns:w16du="http://schemas.microsoft.com/office/word/2023/wordml/word16du" xmlns:w16sdtdh="http://schemas.microsoft.com/office/word/2020/wordml/sdtdatahash" xmlns:w16sdtfl="http://schemas.microsoft.com/office/word/2024/wordml/sdtformatlock" xmlns:w16se="http://schemas.microsoft.com/office/word/2015/wordml/symex" xmlns:wpg="http://schemas.microsoft.com/office/word/2010/wordprocessingGroup" xmlns:wpi="http://schemas.microsoft.com/office/word/2010/wordprocessingInk" xmlns:wne="http://schemas.microsoft.com/office/word/2006/wordml" xmlns:wps="http://schemas.microsoft.com/office/word/2010/wordprocessingShape" mc:Ignorable="w14 w15 w16se w16cid w16 w16cex w16sdtdh w16sdtfl w16du wp14">
+  <w:abstractNum w:abstractNumId="0" w15:restartNumberingAfterBreak="0">
     <w:nsid w:val="0000A990"/>
     <w:multiLevelType w:val="multilevel"/>
+    <w:tmpl w:val="EE80405A"/>
     <w:lvl w:ilvl="0">
       <w:numFmt w:val="bullet"/>
       <w:lvlText w:val=" "/>
@@ -857,9 +846,10 @@
       </w:pPr>
     </w:lvl>
   </w:abstractNum>
-  <w:abstractNum w:abstractNumId="991">
+  <w:abstractNum w:abstractNumId="1" w15:restartNumberingAfterBreak="0">
     <w:nsid w:val="0000A991"/>
     <w:multiLevelType w:val="multilevel"/>
+    <w:tmpl w:val="A858E1F4"/>
     <w:lvl w:ilvl="0">
       <w:numFmt w:val="bullet"/>
       <w:lvlText w:val=""/>
@@ -960,9 +950,10 @@
       </w:rPr>
     </w:lvl>
   </w:abstractNum>
-  <w:abstractNum w:abstractNumId="99411">
+  <w:abstractNum w:abstractNumId="2" w15:restartNumberingAfterBreak="0">
     <w:nsid w:val="00A99411"/>
     <w:multiLevelType w:val="multilevel"/>
+    <w:tmpl w:val="2692067E"/>
     <w:lvl w:ilvl="0">
       <w:start w:val="1"/>
       <w:numFmt w:val="decimal"/>
@@ -1045,17 +1036,17 @@
       </w:pPr>
     </w:lvl>
   </w:abstractNum>
-  <w:num w:numId="1000">
-    <w:abstractNumId w:val="990"/>
+  <w:num w:numId="1" w16cid:durableId="819612917">
+    <w:abstractNumId w:val="0"/>
   </w:num>
-  <w:num w:numId="1001">
-    <w:abstractNumId w:val="991"/>
+  <w:num w:numId="2" w16cid:durableId="1566186942">
+    <w:abstractNumId w:val="1"/>
   </w:num>
-  <w:num w:numId="1002">
-    <w:abstractNumId w:val="991"/>
+  <w:num w:numId="3" w16cid:durableId="1771512486">
+    <w:abstractNumId w:val="1"/>
   </w:num>
-  <w:num w:numId="1003">
-    <w:abstractNumId w:val="99411"/>
+  <w:num w:numId="4" w16cid:durableId="1785076016">
+    <w:abstractNumId w:val="2"/>
     <w:lvlOverride w:ilvl="0">
       <w:startOverride w:val="1"/>
     </w:lvlOverride>
@@ -1084,30 +1075,30 @@
       <w:startOverride w:val="1"/>
     </w:lvlOverride>
   </w:num>
-  <w:num w:numId="1004">
-    <w:abstractNumId w:val="991"/>
+  <w:num w:numId="5" w16cid:durableId="1410007822">
+    <w:abstractNumId w:val="1"/>
   </w:num>
-  <w:num w:numId="1005">
-    <w:abstractNumId w:val="991"/>
+  <w:num w:numId="6" w16cid:durableId="1641687807">
+    <w:abstractNumId w:val="1"/>
   </w:num>
-  <w:num w:numId="1006">
-    <w:abstractNumId w:val="991"/>
+  <w:num w:numId="7" w16cid:durableId="1007370439">
+    <w:abstractNumId w:val="1"/>
   </w:num>
-  <w:num w:numId="1007">
-    <w:abstractNumId w:val="991"/>
+  <w:num w:numId="8" w16cid:durableId="1277565661">
+    <w:abstractNumId w:val="1"/>
   </w:num>
 </w:numbering>
 </file>
 
 <file path=word/styles.xml><?xml version="1.0" encoding="utf-8"?>
-<w:styles xmlns:r="http://schemas.openxmlformats.org/officeDocument/2006/relationships" xmlns:w="http://schemas.openxmlformats.org/wordprocessingml/2006/main">
+<w:styles xmlns:mc="http://schemas.openxmlformats.org/markup-compatibility/2006" xmlns:r="http://schemas.openxmlformats.org/officeDocument/2006/relationships" xmlns:w="http://schemas.openxmlformats.org/wordprocessingml/2006/main" xmlns:w14="http://schemas.microsoft.com/office/word/2010/wordml" xmlns:w15="http://schemas.microsoft.com/office/word/2012/wordml" xmlns:w16cex="http://schemas.microsoft.com/office/word/2018/wordml/cex" xmlns:w16cid="http://schemas.microsoft.com/office/word/2016/wordml/cid" xmlns:w16="http://schemas.microsoft.com/office/word/2018/wordml" xmlns:w16du="http://schemas.microsoft.com/office/word/2023/wordml/word16du" xmlns:w16sdtdh="http://schemas.microsoft.com/office/word/2020/wordml/sdtdatahash" xmlns:w16sdtfl="http://schemas.microsoft.com/office/word/2024/wordml/sdtformatlock" xmlns:w16se="http://schemas.microsoft.com/office/word/2015/wordml/symex" mc:Ignorable="w14 w15 w16se w16cid w16 w16cex w16sdtdh w16sdtfl w16du">
   <w:docDefaults>
     <w:rPrDefault>
       <w:rPr>
-        <w:rFonts w:asciiTheme="minorHAnsi" w:cstheme="minorBidi" w:eastAsiaTheme="minorEastAsia" w:hAnsiTheme="minorHAnsi"/>
+        <w:rFonts w:asciiTheme="minorHAnsi" w:eastAsiaTheme="minorEastAsia" w:hAnsiTheme="minorHAnsi" w:cstheme="minorBidi"/>
         <w:sz w:val="24"/>
         <w:szCs w:val="24"/>
-        <w:lang w:bidi="ar-SA" w:eastAsia="zh-CN" w:val="en-US"/>
+        <w:lang w:val="en-US" w:eastAsia="zh-CN" w:bidi="ar-SA"/>
       </w:rPr>
     </w:rPrDefault>
     <w:pPrDefault>
@@ -1116,168 +1107,255 @@
       </w:pPr>
     </w:pPrDefault>
   </w:docDefaults>
-  <w:latentStyles w:count="276" w:defLockedState="0" w:defQFormat="0" w:defSemiHidden="0" w:defUIPriority="0" w:defUnhideWhenUsed="0"/>
-  <w:style w:default="1" w:styleId="Normal" w:type="paragraph">
+  <w:latentStyles w:defLockedState="0" w:defUIPriority="0" w:defSemiHidden="0" w:defUnhideWhenUsed="0" w:defQFormat="0" w:count="376">
+    <w:lsdException w:name="Normal Table" w:semiHidden="1" w:unhideWhenUsed="1"/>
+    <w:lsdException w:name="Table Simple 1" w:semiHidden="1" w:unhideWhenUsed="1"/>
+    <w:lsdException w:name="Table Simple 2" w:semiHidden="1" w:unhideWhenUsed="1"/>
+    <w:lsdException w:name="Table Simple 3" w:semiHidden="1" w:unhideWhenUsed="1"/>
+    <w:lsdException w:name="Table Classic 1" w:semiHidden="1" w:unhideWhenUsed="1"/>
+    <w:lsdException w:name="Table Classic 2" w:semiHidden="1" w:unhideWhenUsed="1"/>
+    <w:lsdException w:name="Table Classic 3" w:semiHidden="1" w:unhideWhenUsed="1"/>
+    <w:lsdException w:name="Table Classic 4" w:semiHidden="1" w:unhideWhenUsed="1"/>
+    <w:lsdException w:name="Table Colorful 1" w:semiHidden="1" w:unhideWhenUsed="1"/>
+    <w:lsdException w:name="Table Colorful 2" w:semiHidden="1" w:unhideWhenUsed="1"/>
+    <w:lsdException w:name="Table Colorful 3" w:semiHidden="1" w:unhideWhenUsed="1"/>
+    <w:lsdException w:name="Table Columns 1" w:semiHidden="1" w:unhideWhenUsed="1"/>
+    <w:lsdException w:name="Table Columns 2" w:semiHidden="1" w:unhideWhenUsed="1"/>
+    <w:lsdException w:name="Table Columns 3" w:semiHidden="1" w:unhideWhenUsed="1"/>
+    <w:lsdException w:name="Table Columns 4" w:semiHidden="1" w:unhideWhenUsed="1"/>
+    <w:lsdException w:name="Table Columns 5" w:semiHidden="1" w:unhideWhenUsed="1"/>
+    <w:lsdException w:name="Table Grid 1" w:semiHidden="1" w:unhideWhenUsed="1"/>
+    <w:lsdException w:name="Table Grid 2" w:semiHidden="1" w:unhideWhenUsed="1"/>
+    <w:lsdException w:name="Table Grid 3" w:semiHidden="1" w:unhideWhenUsed="1"/>
+    <w:lsdException w:name="Table Grid 4" w:semiHidden="1" w:unhideWhenUsed="1"/>
+    <w:lsdException w:name="Table Grid 5" w:semiHidden="1" w:unhideWhenUsed="1"/>
+    <w:lsdException w:name="Table Grid 6" w:semiHidden="1" w:unhideWhenUsed="1"/>
+    <w:lsdException w:name="Table Grid 7" w:semiHidden="1" w:unhideWhenUsed="1"/>
+    <w:lsdException w:name="Table Grid 8" w:semiHidden="1" w:unhideWhenUsed="1"/>
+    <w:lsdException w:name="Table List 1" w:semiHidden="1" w:unhideWhenUsed="1"/>
+    <w:lsdException w:name="Table List 2" w:semiHidden="1" w:unhideWhenUsed="1"/>
+    <w:lsdException w:name="Table List 3" w:semiHidden="1" w:unhideWhenUsed="1"/>
+    <w:lsdException w:name="Table List 4" w:semiHidden="1" w:unhideWhenUsed="1"/>
+    <w:lsdException w:name="Table List 5" w:semiHidden="1" w:unhideWhenUsed="1"/>
+    <w:lsdException w:name="Table List 6" w:semiHidden="1" w:unhideWhenUsed="1"/>
+    <w:lsdException w:name="Table List 7" w:semiHidden="1" w:unhideWhenUsed="1"/>
+    <w:lsdException w:name="Table List 8" w:semiHidden="1" w:unhideWhenUsed="1"/>
+    <w:lsdException w:name="Table 3D effects 1" w:semiHidden="1" w:unhideWhenUsed="1"/>
+    <w:lsdException w:name="Table 3D effects 2" w:semiHidden="1" w:unhideWhenUsed="1"/>
+    <w:lsdException w:name="Table 3D effects 3" w:semiHidden="1" w:unhideWhenUsed="1"/>
+    <w:lsdException w:name="Table Contemporary" w:semiHidden="1" w:unhideWhenUsed="1"/>
+    <w:lsdException w:name="Table Elegant" w:semiHidden="1" w:unhideWhenUsed="1"/>
+    <w:lsdException w:name="Table Professional" w:semiHidden="1" w:unhideWhenUsed="1"/>
+    <w:lsdException w:name="Table Subtle 1" w:semiHidden="1" w:unhideWhenUsed="1"/>
+    <w:lsdException w:name="Table Subtle 2" w:semiHidden="1" w:unhideWhenUsed="1"/>
+    <w:lsdException w:name="Table Web 1" w:semiHidden="1" w:unhideWhenUsed="1"/>
+    <w:lsdException w:name="Table Web 2" w:semiHidden="1" w:unhideWhenUsed="1"/>
+    <w:lsdException w:name="Table Web 3" w:semiHidden="1" w:unhideWhenUsed="1"/>
+    <w:lsdException w:name="Table Theme" w:semiHidden="1" w:unhideWhenUsed="1"/>
+    <w:lsdException w:name="Light Shading"/>
+    <w:lsdException w:name="Light List"/>
+    <w:lsdException w:name="Light Grid"/>
+    <w:lsdException w:name="Medium Shading 1"/>
+    <w:lsdException w:name="Medium Shading 2"/>
+    <w:lsdException w:name="Medium List 1"/>
+    <w:lsdException w:name="Medium List 2"/>
+    <w:lsdException w:name="Medium Grid 1"/>
+    <w:lsdException w:name="Medium Grid 2"/>
+    <w:lsdException w:name="Medium Grid 3"/>
+    <w:lsdException w:name="Dark List"/>
+    <w:lsdException w:name="Colorful Shading"/>
+    <w:lsdException w:name="Colorful List"/>
+    <w:lsdException w:name="Colorful Grid"/>
+    <w:lsdException w:name="Light Shading Accent 1"/>
+    <w:lsdException w:name="Light List Accent 1"/>
+    <w:lsdException w:name="Light Grid Accent 1"/>
+    <w:lsdException w:name="Medium Shading 1 Accent 1"/>
+    <w:lsdException w:name="Medium Shading 2 Accent 1"/>
+    <w:lsdException w:name="Medium List 1 Accent 1"/>
+    <w:lsdException w:name="Medium List 2 Accent 1"/>
+    <w:lsdException w:name="Medium Grid 1 Accent 1"/>
+    <w:lsdException w:name="Medium Grid 2 Accent 1"/>
+    <w:lsdException w:name="Medium Grid 3 Accent 1"/>
+    <w:lsdException w:name="Dark List Accent 1"/>
+    <w:lsdException w:name="Colorful Shading Accent 1"/>
+    <w:lsdException w:name="Colorful List Accent 1"/>
+    <w:lsdException w:name="Colorful Grid Accent 1"/>
+    <w:lsdException w:name="Light Shading Accent 2"/>
+    <w:lsdException w:name="Light List Accent 2"/>
+    <w:lsdException w:name="Light Grid Accent 2"/>
+    <w:lsdException w:name="Medium Shading 1 Accent 2"/>
+    <w:lsdException w:name="Medium Shading 2 Accent 2"/>
+    <w:lsdException w:name="Medium List 1 Accent 2"/>
+    <w:lsdException w:name="Medium List 2 Accent 2"/>
+    <w:lsdException w:name="Medium Grid 1 Accent 2"/>
+    <w:lsdException w:name="Medium Grid 2 Accent 2"/>
+    <w:lsdException w:name="Medium Grid 3 Accent 2"/>
+    <w:lsdException w:name="Dark List Accent 2"/>
+    <w:lsdException w:name="Colorful Shading Accent 2"/>
+    <w:lsdException w:name="Colorful List Accent 2"/>
+    <w:lsdException w:name="Colorful Grid Accent 2"/>
+    <w:lsdException w:name="Light Shading Accent 3"/>
+    <w:lsdException w:name="Light List Accent 3"/>
+    <w:lsdException w:name="Light Grid Accent 3"/>
+    <w:lsdException w:name="Medium Shading 1 Accent 3"/>
+    <w:lsdException w:name="Medium Shading 2 Accent 3"/>
+    <w:lsdException w:name="Medium List 1 Accent 3"/>
+    <w:lsdException w:name="Medium List 2 Accent 3"/>
+    <w:lsdException w:name="Medium Grid 1 Accent 3"/>
+    <w:lsdException w:name="Medium Grid 2 Accent 3"/>
+    <w:lsdException w:name="Medium Grid 3 Accent 3"/>
+    <w:lsdException w:name="Dark List Accent 3"/>
+    <w:lsdException w:name="Colorful Shading Accent 3"/>
+    <w:lsdException w:name="Colorful List Accent 3"/>
+    <w:lsdException w:name="Colorful Grid Accent 3"/>
+    <w:lsdException w:name="Light Shading Accent 4"/>
+    <w:lsdException w:name="Light List Accent 4"/>
+    <w:lsdException w:name="Light Grid Accent 4"/>
+    <w:lsdException w:name="Medium Shading 1 Accent 4"/>
+    <w:lsdException w:name="Medium Shading 2 Accent 4"/>
+    <w:lsdException w:name="Medium List 1 Accent 4"/>
+    <w:lsdException w:name="Medium List 2 Accent 4"/>
+    <w:lsdException w:name="Medium Grid 1 Accent 4"/>
+    <w:lsdException w:name="Medium Grid 2 Accent 4"/>
+    <w:lsdException w:name="Medium Grid 3 Accent 4"/>
+    <w:lsdException w:name="Dark List Accent 4"/>
+    <w:lsdException w:name="Colorful Shading Accent 4"/>
+    <w:lsdException w:name="Colorful List Accent 4"/>
+    <w:lsdException w:name="Colorful Grid Accent 4"/>
+    <w:lsdException w:name="Light Shading Accent 5"/>
+    <w:lsdException w:name="Light List Accent 5"/>
+    <w:lsdException w:name="Light Grid Accent 5"/>
+    <w:lsdException w:name="Medium Shading 1 Accent 5"/>
+    <w:lsdException w:name="Medium Shading 2 Accent 5"/>
+    <w:lsdException w:name="Medium List 1 Accent 5"/>
+    <w:lsdException w:name="Medium List 2 Accent 5"/>
+    <w:lsdException w:name="Medium Grid 1 Accent 5"/>
+    <w:lsdException w:name="Medium Grid 2 Accent 5"/>
+    <w:lsdException w:name="Medium Grid 3 Accent 5"/>
+    <w:lsdException w:name="Dark List Accent 5"/>
+    <w:lsdException w:name="Colorful Shading Accent 5"/>
+    <w:lsdException w:name="Colorful List Accent 5"/>
+    <w:lsdException w:name="Colorful Grid Accent 5"/>
+    <w:lsdException w:name="Light Shading Accent 6"/>
+    <w:lsdException w:name="Light List Accent 6"/>
+    <w:lsdException w:name="Light Grid Accent 6"/>
+    <w:lsdException w:name="Medium Shading 1 Accent 6"/>
+    <w:lsdException w:name="Medium Shading 2 Accent 6"/>
+    <w:lsdException w:name="Medium List 1 Accent 6"/>
+    <w:lsdException w:name="Medium List 2 Accent 6"/>
+    <w:lsdException w:name="Medium Grid 1 Accent 6"/>
+    <w:lsdException w:name="Medium Grid 2 Accent 6"/>
+    <w:lsdException w:name="Medium Grid 3 Accent 6"/>
+    <w:lsdException w:name="Dark List Accent 6"/>
+    <w:lsdException w:name="Colorful Shading Accent 6"/>
+    <w:lsdException w:name="Colorful List Accent 6"/>
+    <w:lsdException w:name="Colorful Grid Accent 6"/>
+    <w:lsdException w:name="Grid Table 4" w:uiPriority="49"/>
+    <w:lsdException w:name="Grid Table 5 Dark" w:uiPriority="50"/>
+    <w:lsdException w:name="Grid Table 6 Colorful" w:uiPriority="51"/>
+    <w:lsdException w:name="Grid Table 7 Colorful" w:uiPriority="52"/>
+    <w:lsdException w:name="Grid Table 1 Light Accent 1" w:uiPriority="46"/>
+    <w:lsdException w:name="Grid Table 2 Accent 1" w:uiPriority="47"/>
+    <w:lsdException w:name="Grid Table 3 Accent 1" w:uiPriority="48"/>
+    <w:lsdException w:name="Grid Table 4 Accent 1" w:uiPriority="49"/>
+    <w:lsdException w:name="Grid Table 5 Dark Accent 1" w:uiPriority="50"/>
+    <w:lsdException w:name="Grid Table 6 Colorful Accent 1" w:uiPriority="51"/>
+    <w:lsdException w:name="Grid Table 7 Colorful Accent 1" w:uiPriority="52"/>
+    <w:lsdException w:name="Grid Table 1 Light Accent 2" w:uiPriority="46"/>
+    <w:lsdException w:name="Grid Table 2 Accent 2" w:uiPriority="47"/>
+    <w:lsdException w:name="Grid Table 3 Accent 2" w:uiPriority="48"/>
+    <w:lsdException w:name="Grid Table 4 Accent 2" w:uiPriority="49"/>
+    <w:lsdException w:name="Grid Table 5 Dark Accent 2" w:uiPriority="50"/>
+    <w:lsdException w:name="Grid Table 6 Colorful Accent 2" w:uiPriority="51"/>
+    <w:lsdException w:name="Grid Table 7 Colorful Accent 2" w:uiPriority="52"/>
+    <w:lsdException w:name="Grid Table 1 Light Accent 3" w:uiPriority="46"/>
+    <w:lsdException w:name="Grid Table 2 Accent 3" w:uiPriority="47"/>
+    <w:lsdException w:name="Grid Table 3 Accent 3" w:uiPriority="48"/>
+    <w:lsdException w:name="Grid Table 4 Accent 3" w:uiPriority="49"/>
+    <w:lsdException w:name="Grid Table 5 Dark Accent 3" w:uiPriority="50"/>
+    <w:lsdException w:name="Grid Table 6 Colorful Accent 3" w:uiPriority="51"/>
+    <w:lsdException w:name="Grid Table 7 Colorful Accent 3" w:uiPriority="52"/>
+    <w:lsdException w:name="Grid Table 1 Light Accent 4" w:uiPriority="46"/>
+    <w:lsdException w:name="Grid Table 2 Accent 4" w:uiPriority="47"/>
+    <w:lsdException w:name="Grid Table 3 Accent 4" w:uiPriority="48"/>
+    <w:lsdException w:name="Grid Table 4 Accent 4" w:uiPriority="49"/>
+    <w:lsdException w:name="Grid Table 5 Dark Accent 4" w:uiPriority="50"/>
+    <w:lsdException w:name="Grid Table 6 Colorful Accent 4" w:uiPriority="51"/>
+    <w:lsdException w:name="Grid Table 7 Colorful Accent 4" w:uiPriority="52"/>
+    <w:lsdException w:name="Grid Table 1 Light Accent 5" w:uiPriority="46"/>
+    <w:lsdException w:name="Grid Table 2 Accent 5" w:uiPriority="47"/>
+    <w:lsdException w:name="Grid Table 3 Accent 5" w:uiPriority="48"/>
+    <w:lsdException w:name="Grid Table 4 Accent 5" w:uiPriority="49"/>
+    <w:lsdException w:name="Grid Table 5 Dark Accent 5" w:uiPriority="50"/>
+    <w:lsdException w:name="Grid Table 6 Colorful Accent 5" w:uiPriority="51"/>
+    <w:lsdException w:name="Grid Table 7 Colorful Accent 5" w:uiPriority="52"/>
+    <w:lsdException w:name="Grid Table 1 Light Accent 6" w:uiPriority="46"/>
+    <w:lsdException w:name="Grid Table 2 Accent 6" w:uiPriority="47"/>
+    <w:lsdException w:name="Grid Table 3 Accent 6" w:uiPriority="48"/>
+    <w:lsdException w:name="Grid Table 4 Accent 6" w:uiPriority="49"/>
+    <w:lsdException w:name="Grid Table 5 Dark Accent 6" w:uiPriority="50"/>
+    <w:lsdException w:name="Grid Table 6 Colorful Accent 6" w:uiPriority="51"/>
+    <w:lsdException w:name="Grid Table 7 Colorful Accent 6" w:uiPriority="52"/>
+    <w:lsdException w:name="List Table 1 Light" w:uiPriority="46"/>
+    <w:lsdException w:name="List Table 2" w:uiPriority="47"/>
+    <w:lsdException w:name="List Table 3" w:uiPriority="48"/>
+    <w:lsdException w:name="List Table 4" w:uiPriority="49"/>
+    <w:lsdException w:name="List Table 5 Dark" w:uiPriority="50"/>
+    <w:lsdException w:name="List Table 6 Colorful" w:uiPriority="51"/>
+    <w:lsdException w:name="List Table 7 Colorful" w:uiPriority="52"/>
+    <w:lsdException w:name="List Table 1 Light Accent 1" w:uiPriority="46"/>
+    <w:lsdException w:name="List Table 2 Accent 1" w:uiPriority="47"/>
+    <w:lsdException w:name="List Table 3 Accent 1" w:uiPriority="48"/>
+    <w:lsdException w:name="List Table 4 Accent 1" w:uiPriority="49"/>
+    <w:lsdException w:name="List Table 5 Dark Accent 1" w:uiPriority="50"/>
+    <w:lsdException w:name="List Table 6 Colorful Accent 1" w:uiPriority="51"/>
+    <w:lsdException w:name="List Table 7 Colorful Accent 1" w:uiPriority="52"/>
+    <w:lsdException w:name="List Table 1 Light Accent 2" w:uiPriority="46"/>
+    <w:lsdException w:name="List Table 2 Accent 2" w:uiPriority="47"/>
+    <w:lsdException w:name="List Table 3 Accent 2" w:uiPriority="48"/>
+    <w:lsdException w:name="List Table 4 Accent 2" w:uiPriority="49"/>
+    <w:lsdException w:name="List Table 5 Dark Accent 2" w:uiPriority="50"/>
+    <w:lsdException w:name="List Table 6 Colorful Accent 2" w:uiPriority="51"/>
+    <w:lsdException w:name="List Table 7 Colorful Accent 2" w:uiPriority="52"/>
+    <w:lsdException w:name="List Table 1 Light Accent 3" w:uiPriority="46"/>
+    <w:lsdException w:name="List Table 2 Accent 3" w:uiPriority="47"/>
+    <w:lsdException w:name="List Table 3 Accent 3" w:uiPriority="48"/>
+    <w:lsdException w:name="List Table 4 Accent 3" w:uiPriority="49"/>
+    <w:lsdException w:name="List Table 5 Dark Accent 3" w:uiPriority="50"/>
+    <w:lsdException w:name="List Table 6 Colorful Accent 3" w:uiPriority="51"/>
+    <w:lsdException w:name="List Table 7 Colorful Accent 3" w:uiPriority="52"/>
+    <w:lsdException w:name="List Table 1 Light Accent 4" w:uiPriority="46"/>
+    <w:lsdException w:name="List Table 2 Accent 4" w:uiPriority="47"/>
+    <w:lsdException w:name="List Table 3 Accent 4" w:uiPriority="48"/>
+    <w:lsdException w:name="List Table 4 Accent 4" w:uiPriority="49"/>
+    <w:lsdException w:name="List Table 5 Dark Accent 4" w:uiPriority="50"/>
+    <w:lsdException w:name="List Table 6 Colorful Accent 4" w:uiPriority="51"/>
+    <w:lsdException w:name="List Table 7 Colorful Accent 4" w:uiPriority="52"/>
+    <w:lsdException w:name="List Table 1 Light Accent 5" w:uiPriority="46"/>
+    <w:lsdException w:name="List Table 2 Accent 5" w:uiPriority="47"/>
+    <w:lsdException w:name="List Table 3 Accent 5" w:uiPriority="48"/>
+    <w:lsdException w:name="List Table 4 Accent 5" w:uiPriority="49"/>
+    <w:lsdException w:name="List Table 5 Dark Accent 5" w:uiPriority="50"/>
+    <w:lsdException w:name="List Table 6 Colorful Accent 5" w:uiPriority="51"/>
+    <w:lsdException w:name="List Table 7 Colorful Accent 5" w:uiPriority="52"/>
+    <w:lsdException w:name="List Table 1 Light Accent 6" w:uiPriority="46"/>
+    <w:lsdException w:name="List Table 2 Accent 6" w:uiPriority="47"/>
+    <w:lsdException w:name="List Table 3 Accent 6" w:uiPriority="48"/>
+    <w:lsdException w:name="List Table 4 Accent 6" w:uiPriority="49"/>
+    <w:lsdException w:name="List Table 5 Dark Accent 6" w:uiPriority="50"/>
+    <w:lsdException w:name="List Table 6 Colorful Accent 6" w:uiPriority="51"/>
+    <w:lsdException w:name="List Table 7 Colorful Accent 6" w:uiPriority="52"/>
+    <w:lsdException w:name="Mention" w:semiHidden="1" w:uiPriority="99" w:unhideWhenUsed="1"/>
+    <w:lsdException w:name="Smart Hyperlink" w:semiHidden="1" w:uiPriority="99" w:unhideWhenUsed="1"/>
+    <w:lsdException w:name="Hashtag" w:semiHidden="1" w:uiPriority="99" w:unhideWhenUsed="1"/>
+    <w:lsdException w:name="Unresolved Mention" w:semiHidden="1" w:uiPriority="99" w:unhideWhenUsed="1"/>
+    <w:lsdException w:name="Smart Link" w:semiHidden="1" w:uiPriority="99" w:unhideWhenUsed="1"/>
+  </w:latentStyles>
+  <w:style w:type="paragraph" w:default="1" w:styleId="Normal">
     <w:name w:val="Normal"/>
     <w:qFormat/>
   </w:style>
-  <w:style w:styleId="BodyText" w:type="paragraph">
-    <w:name w:val="Body Text"/>
-    <w:basedOn w:val="Normal"/>
-    <w:link w:val="BodyTextChar"/>
-    <w:qFormat/>
-    <w:pPr>
-      <w:spacing w:after="180" w:before="180"/>
-    </w:pPr>
-  </w:style>
-  <w:style w:customStyle="1" w:styleId="FirstParagraph" w:type="paragraph">
-    <w:name w:val="First Paragraph"/>
-    <w:basedOn w:val="BodyText"/>
-    <w:next w:val="BodyText"/>
-    <w:qFormat/>
-  </w:style>
-  <w:style w:customStyle="1" w:styleId="Compact" w:type="paragraph">
-    <w:name w:val="Compact"/>
-    <w:basedOn w:val="BodyText"/>
-    <w:qFormat/>
-    <w:pPr>
-      <w:spacing w:after="36" w:before="36"/>
-    </w:pPr>
-  </w:style>
-  <w:style w:styleId="Title" w:type="paragraph">
-    <w:name w:val="Title"/>
-    <w:basedOn w:val="Normal"/>
-    <w:next w:val="BodyText"/>
-    <w:link w:val="TitleChar"/>
-    <w:uiPriority w:val="10"/>
-    <w:qFormat/>
-    <w:rsid w:val="00A10FD9"/>
-    <w:pPr>
-      <w:spacing w:after="80" w:line="240" w:lineRule="auto"/>
-      <w:contextualSpacing/>
-      <w:jc w:val="center"/>
-    </w:pPr>
-    <w:rPr>
-      <w:rFonts w:asciiTheme="majorHAnsi" w:cstheme="majorBidi" w:eastAsiaTheme="majorEastAsia" w:hAnsiTheme="majorHAnsi"/>
-      <w:sz w:val="56"/>
-      <w:szCs w:val="56"/>
-    </w:rPr>
-  </w:style>
-  <w:style w:customStyle="1" w:styleId="TitleChar" w:type="character">
-    <w:name w:val="Title Char"/>
-    <w:basedOn w:val="DefaultParagraphFont"/>
-    <w:link w:val="Title"/>
-    <w:uiPriority w:val="10"/>
-    <w:rsid w:val="00A10FD9"/>
-    <w:rPr>
-      <w:rFonts w:asciiTheme="majorHAnsi" w:cstheme="majorBidi" w:eastAsiaTheme="majorEastAsia" w:hAnsiTheme="majorHAnsi"/>
-      <w:sz w:val="56"/>
-      <w:szCs w:val="56"/>
-    </w:rPr>
-  </w:style>
-  <w:style w:styleId="Subtitle" w:type="paragraph">
-    <w:name w:val="Subtitle"/>
-    <w:basedOn w:val="Title"/>
-    <w:next w:val="BodyText"/>
-    <w:link w:val="SubtitleChar"/>
-    <w:uiPriority w:val="11"/>
-    <w:qFormat/>
-    <w:rsid w:val="00A10FD9"/>
-    <w:pPr>
-      <w:numPr>
-        <w:ilvl w:val="1"/>
-      </w:numPr>
-    </w:pPr>
-    <w:rPr>
-      <w:rFonts w:cstheme="majorBidi" w:eastAsiaTheme="majorEastAsia"/>
-      <w:spacing w:val="15"/>
-      <w:sz w:val="28"/>
-      <w:szCs w:val="28"/>
-    </w:rPr>
-  </w:style>
-  <w:style w:customStyle="1" w:styleId="SubtitleChar" w:type="character">
-    <w:name w:val="Subtitle Char"/>
-    <w:basedOn w:val="DefaultParagraphFont"/>
-    <w:link w:val="Subtitle"/>
-    <w:uiPriority w:val="11"/>
-    <w:rsid w:val="00A10FD9"/>
-    <w:rPr>
-      <w:rFonts w:cstheme="majorBidi" w:eastAsiaTheme="majorEastAsia"/>
-      <w:color w:themeColor="text1" w:themeTint="A6" w:val="595959"/>
-      <w:spacing w:val="15"/>
-      <w:sz w:val="28"/>
-      <w:szCs w:val="28"/>
-    </w:rPr>
-  </w:style>
-  <w:style w:customStyle="1" w:styleId="Author" w:type="paragraph">
-    <w:name w:val="Author"/>
-    <w:basedOn w:val="Title"/>
-    <w:next w:val="BodyText"/>
-    <w:qFormat/>
-    <w:pPr>
-      <w:keepNext/>
-      <w:keepLines/>
-    </w:pPr>
-    <w:rPr>
-      <w:sz w:val="24"/>
-      <w:szCs w:val="24"/>
-    </w:rPr>
-  </w:style>
-  <w:style w:styleId="Date" w:type="paragraph">
-    <w:name w:val="Date"/>
-    <w:basedOn w:val="Title"/>
-    <w:next w:val="BodyText"/>
-    <w:qFormat/>
-    <w:pPr>
-      <w:keepNext/>
-      <w:keepLines/>
-    </w:pPr>
-    <w:rPr>
-      <w:sz w:val="24"/>
-      <w:szCs w:val="24"/>
-    </w:rPr>
-  </w:style>
-  <w:style w:customStyle="1" w:styleId="AbstractTitle" w:type="paragraph">
-    <w:name w:val="Abstract Title"/>
-    <w:basedOn w:val="Normal"/>
-    <w:next w:val="Abstract"/>
-    <w:qFormat/>
-    <w:pPr>
-      <w:keepNext/>
-      <w:keepLines/>
-      <w:spacing w:after="0" w:before="300"/>
-      <w:jc w:val="center"/>
-    </w:pPr>
-    <w:rPr>
-      <w:b/>
-      <w:sz w:val="20"/>
-      <w:szCs w:val="20"/>
-    </w:rPr>
-  </w:style>
-  <w:style w:customStyle="1" w:styleId="Abstract" w:type="paragraph">
-    <w:name w:val="Abstract"/>
-    <w:basedOn w:val="Normal"/>
-    <w:next w:val="BodyText"/>
-    <w:qFormat/>
-    <w:pPr>
-      <w:keepNext/>
-      <w:keepLines/>
-      <w:spacing w:after="300" w:before="100"/>
-    </w:pPr>
-    <w:rPr>
-      <w:sz w:val="20"/>
-      <w:szCs w:val="20"/>
-    </w:rPr>
-  </w:style>
-  <w:style w:styleId="Bibliography" w:type="paragraph">
-    <w:name w:val="Bibliography"/>
-    <w:basedOn w:val="Normal"/>
-    <w:next w:val="Bibliography"/>
-    <w:qFormat/>
-    <w:pPr/>
-    <w:rPr/>
-  </w:style>
-  <w:style w:styleId="Heading1" w:type="paragraph">
+  <w:style w:type="paragraph" w:styleId="Heading1">
     <w:name w:val="heading 1"/>
     <w:basedOn w:val="Normal"/>
     <w:next w:val="BodyText"/>
@@ -1288,17 +1366,17 @@
     <w:pPr>
       <w:keepNext/>
       <w:keepLines/>
-      <w:spacing w:after="80" w:before="360"/>
+      <w:spacing w:before="360" w:after="80"/>
       <w:outlineLvl w:val="0"/>
     </w:pPr>
     <w:rPr>
-      <w:rFonts w:asciiTheme="majorHAnsi" w:cstheme="majorBidi" w:eastAsiaTheme="majorEastAsia" w:hAnsiTheme="majorHAnsi"/>
-      <w:color w:themeColor="accent1" w:themeShade="BF" w:val="0F4761"/>
+      <w:rFonts w:asciiTheme="majorHAnsi" w:eastAsiaTheme="majorEastAsia" w:hAnsiTheme="majorHAnsi" w:cstheme="majorBidi"/>
+      <w:color w:val="0F4761" w:themeColor="accent1" w:themeShade="BF"/>
       <w:sz w:val="40"/>
       <w:szCs w:val="40"/>
     </w:rPr>
   </w:style>
-  <w:style w:styleId="Heading2" w:type="paragraph">
+  <w:style w:type="paragraph" w:styleId="Heading2">
     <w:name w:val="heading 2"/>
     <w:basedOn w:val="Normal"/>
     <w:next w:val="BodyText"/>
@@ -1311,17 +1389,17 @@
     <w:pPr>
       <w:keepNext/>
       <w:keepLines/>
-      <w:spacing w:after="80" w:before="160"/>
+      <w:spacing w:before="160" w:after="80"/>
       <w:outlineLvl w:val="1"/>
     </w:pPr>
     <w:rPr>
-      <w:rFonts w:asciiTheme="majorHAnsi" w:cstheme="majorBidi" w:eastAsiaTheme="majorEastAsia" w:hAnsiTheme="majorHAnsi"/>
-      <w:color w:themeColor="accent1" w:themeShade="BF" w:val="0F4761"/>
+      <w:rFonts w:asciiTheme="majorHAnsi" w:eastAsiaTheme="majorEastAsia" w:hAnsiTheme="majorHAnsi" w:cstheme="majorBidi"/>
+      <w:color w:val="0F4761" w:themeColor="accent1" w:themeShade="BF"/>
       <w:sz w:val="32"/>
       <w:szCs w:val="32"/>
     </w:rPr>
   </w:style>
-  <w:style w:styleId="Heading3" w:type="paragraph">
+  <w:style w:type="paragraph" w:styleId="Heading3">
     <w:name w:val="heading 3"/>
     <w:basedOn w:val="Normal"/>
     <w:next w:val="BodyText"/>
@@ -1334,17 +1412,17 @@
     <w:pPr>
       <w:keepNext/>
       <w:keepLines/>
-      <w:spacing w:after="80" w:before="160"/>
+      <w:spacing w:before="160" w:after="80"/>
       <w:outlineLvl w:val="2"/>
     </w:pPr>
     <w:rPr>
-      <w:rFonts w:cstheme="majorBidi" w:eastAsiaTheme="majorEastAsia"/>
-      <w:color w:themeColor="accent1" w:themeShade="BF" w:val="0F4761"/>
+      <w:rFonts w:eastAsiaTheme="majorEastAsia" w:cstheme="majorBidi"/>
+      <w:color w:val="0F4761" w:themeColor="accent1" w:themeShade="BF"/>
       <w:sz w:val="28"/>
       <w:szCs w:val="28"/>
     </w:rPr>
   </w:style>
-  <w:style w:styleId="Heading4" w:type="paragraph">
+  <w:style w:type="paragraph" w:styleId="Heading4">
     <w:name w:val="heading 4"/>
     <w:basedOn w:val="Normal"/>
     <w:next w:val="BodyText"/>
@@ -1357,17 +1435,17 @@
     <w:pPr>
       <w:keepNext/>
       <w:keepLines/>
-      <w:spacing w:after="40" w:before="80"/>
+      <w:spacing w:before="80" w:after="40"/>
       <w:outlineLvl w:val="3"/>
     </w:pPr>
     <w:rPr>
-      <w:rFonts w:cstheme="majorBidi" w:eastAsiaTheme="majorEastAsia"/>
+      <w:rFonts w:eastAsiaTheme="majorEastAsia" w:cstheme="majorBidi"/>
       <w:i/>
       <w:iCs/>
-      <w:color w:themeColor="accent1" w:themeShade="BF" w:val="0F4761"/>
-    </w:rPr>
-  </w:style>
-  <w:style w:styleId="Heading5" w:type="paragraph">
+      <w:color w:val="0F4761" w:themeColor="accent1" w:themeShade="BF"/>
+    </w:rPr>
+  </w:style>
+  <w:style w:type="paragraph" w:styleId="Heading5">
     <w:name w:val="heading 5"/>
     <w:basedOn w:val="Normal"/>
     <w:next w:val="BodyText"/>
@@ -1380,15 +1458,15 @@
     <w:pPr>
       <w:keepNext/>
       <w:keepLines/>
-      <w:spacing w:after="40" w:before="80"/>
+      <w:spacing w:before="80" w:after="40"/>
       <w:outlineLvl w:val="4"/>
     </w:pPr>
     <w:rPr>
-      <w:rFonts w:cstheme="majorBidi" w:eastAsiaTheme="majorEastAsia"/>
-      <w:color w:themeColor="accent1" w:themeShade="BF" w:val="0F4761"/>
-    </w:rPr>
-  </w:style>
-  <w:style w:styleId="Heading6" w:type="paragraph">
+      <w:rFonts w:eastAsiaTheme="majorEastAsia" w:cstheme="majorBidi"/>
+      <w:color w:val="0F4761" w:themeColor="accent1" w:themeShade="BF"/>
+    </w:rPr>
+  </w:style>
+  <w:style w:type="paragraph" w:styleId="Heading6">
     <w:name w:val="heading 6"/>
     <w:basedOn w:val="Normal"/>
     <w:next w:val="BodyText"/>
@@ -1401,17 +1479,17 @@
     <w:pPr>
       <w:keepNext/>
       <w:keepLines/>
-      <w:spacing w:after="0" w:before="40"/>
+      <w:spacing w:before="40" w:after="0"/>
       <w:outlineLvl w:val="5"/>
     </w:pPr>
     <w:rPr>
-      <w:rFonts w:cstheme="majorBidi" w:eastAsiaTheme="majorEastAsia"/>
+      <w:rFonts w:eastAsiaTheme="majorEastAsia" w:cstheme="majorBidi"/>
       <w:i/>
       <w:iCs/>
-      <w:color w:themeColor="text1" w:themeTint="A6" w:val="595959"/>
-    </w:rPr>
-  </w:style>
-  <w:style w:styleId="Heading7" w:type="paragraph">
+      <w:color w:val="595959" w:themeColor="text1" w:themeTint="A6"/>
+    </w:rPr>
+  </w:style>
+  <w:style w:type="paragraph" w:styleId="Heading7">
     <w:name w:val="heading 7"/>
     <w:basedOn w:val="Normal"/>
     <w:next w:val="BodyText"/>
@@ -1424,15 +1502,15 @@
     <w:pPr>
       <w:keepNext/>
       <w:keepLines/>
-      <w:spacing w:after="0" w:before="40"/>
+      <w:spacing w:before="40" w:after="0"/>
       <w:outlineLvl w:val="6"/>
     </w:pPr>
     <w:rPr>
-      <w:rFonts w:cstheme="majorBidi" w:eastAsiaTheme="majorEastAsia"/>
-      <w:color w:themeColor="text1" w:themeTint="A6" w:val="595959"/>
-    </w:rPr>
-  </w:style>
-  <w:style w:styleId="Heading8" w:type="paragraph">
+      <w:rFonts w:eastAsiaTheme="majorEastAsia" w:cstheme="majorBidi"/>
+      <w:color w:val="595959" w:themeColor="text1" w:themeTint="A6"/>
+    </w:rPr>
+  </w:style>
+  <w:style w:type="paragraph" w:styleId="Heading8">
     <w:name w:val="heading 8"/>
     <w:basedOn w:val="Normal"/>
     <w:next w:val="BodyText"/>
@@ -1449,13 +1527,13 @@
       <w:outlineLvl w:val="7"/>
     </w:pPr>
     <w:rPr>
-      <w:rFonts w:cstheme="majorBidi" w:eastAsiaTheme="majorEastAsia"/>
+      <w:rFonts w:eastAsiaTheme="majorEastAsia" w:cstheme="majorBidi"/>
       <w:i/>
       <w:iCs/>
-      <w:color w:themeColor="text1" w:themeTint="D8" w:val="272727"/>
-    </w:rPr>
-  </w:style>
-  <w:style w:styleId="Heading9" w:type="paragraph">
+      <w:color w:val="272727" w:themeColor="text1" w:themeTint="D8"/>
+    </w:rPr>
+  </w:style>
+  <w:style w:type="paragraph" w:styleId="Heading9">
     <w:name w:val="heading 9"/>
     <w:basedOn w:val="Normal"/>
     <w:next w:val="BodyText"/>
@@ -1472,24 +1550,202 @@
       <w:outlineLvl w:val="8"/>
     </w:pPr>
     <w:rPr>
-      <w:rFonts w:cstheme="majorBidi" w:eastAsiaTheme="majorEastAsia"/>
-      <w:color w:themeColor="text1" w:themeTint="D8" w:val="272727"/>
-    </w:rPr>
-  </w:style>
-  <w:style w:customStyle="1" w:styleId="Heading1Char" w:type="character">
+      <w:rFonts w:eastAsiaTheme="majorEastAsia" w:cstheme="majorBidi"/>
+      <w:color w:val="272727" w:themeColor="text1" w:themeTint="D8"/>
+    </w:rPr>
+  </w:style>
+  <w:style w:type="character" w:default="1" w:styleId="DefaultParagraphFont">
+    <w:name w:val="Default Paragraph Font"/>
+    <w:uiPriority w:val="1"/>
+    <w:semiHidden/>
+    <w:unhideWhenUsed/>
+  </w:style>
+  <w:style w:type="table" w:default="1" w:styleId="TableNormal">
+    <w:name w:val="Normal Table"/>
+    <w:uiPriority w:val="99"/>
+    <w:semiHidden/>
+    <w:unhideWhenUsed/>
+    <w:tblPr>
+      <w:tblInd w:w="0" w:type="dxa"/>
+      <w:tblCellMar>
+        <w:top w:w="0" w:type="dxa"/>
+        <w:left w:w="108" w:type="dxa"/>
+        <w:bottom w:w="0" w:type="dxa"/>
+        <w:right w:w="108" w:type="dxa"/>
+      </w:tblCellMar>
+    </w:tblPr>
+  </w:style>
+  <w:style w:type="numbering" w:default="1" w:styleId="NoList">
+    <w:name w:val="No List"/>
+    <w:uiPriority w:val="99"/>
+    <w:semiHidden/>
+    <w:unhideWhenUsed/>
+  </w:style>
+  <w:style w:type="paragraph" w:styleId="BodyText">
+    <w:name w:val="Body Text"/>
+    <w:basedOn w:val="Normal"/>
+    <w:qFormat/>
+    <w:pPr>
+      <w:spacing w:before="180" w:after="180"/>
+    </w:pPr>
+  </w:style>
+  <w:style w:type="paragraph" w:customStyle="1" w:styleId="FirstParagraph">
+    <w:name w:val="First Paragraph"/>
+    <w:basedOn w:val="BodyText"/>
+    <w:next w:val="BodyText"/>
+    <w:qFormat/>
+  </w:style>
+  <w:style w:type="paragraph" w:customStyle="1" w:styleId="Compact">
+    <w:name w:val="Compact"/>
+    <w:basedOn w:val="BodyText"/>
+    <w:qFormat/>
+    <w:pPr>
+      <w:spacing w:before="36" w:after="36"/>
+    </w:pPr>
+  </w:style>
+  <w:style w:type="paragraph" w:styleId="Title">
+    <w:name w:val="Title"/>
+    <w:basedOn w:val="Normal"/>
+    <w:next w:val="BodyText"/>
+    <w:link w:val="TitleChar"/>
+    <w:uiPriority w:val="10"/>
+    <w:qFormat/>
+    <w:rsid w:val="00A10FD9"/>
+    <w:pPr>
+      <w:spacing w:after="80"/>
+      <w:contextualSpacing/>
+      <w:jc w:val="center"/>
+    </w:pPr>
+    <w:rPr>
+      <w:rFonts w:asciiTheme="majorHAnsi" w:eastAsiaTheme="majorEastAsia" w:hAnsiTheme="majorHAnsi" w:cstheme="majorBidi"/>
+      <w:sz w:val="56"/>
+      <w:szCs w:val="56"/>
+    </w:rPr>
+  </w:style>
+  <w:style w:type="character" w:customStyle="1" w:styleId="TitleChar">
+    <w:name w:val="Title Char"/>
+    <w:basedOn w:val="DefaultParagraphFont"/>
+    <w:link w:val="Title"/>
+    <w:uiPriority w:val="10"/>
+    <w:rsid w:val="00A10FD9"/>
+    <w:rPr>
+      <w:rFonts w:asciiTheme="majorHAnsi" w:eastAsiaTheme="majorEastAsia" w:hAnsiTheme="majorHAnsi" w:cstheme="majorBidi"/>
+      <w:sz w:val="56"/>
+      <w:szCs w:val="56"/>
+    </w:rPr>
+  </w:style>
+  <w:style w:type="paragraph" w:styleId="Subtitle">
+    <w:name w:val="Subtitle"/>
+    <w:basedOn w:val="Title"/>
+    <w:next w:val="BodyText"/>
+    <w:link w:val="SubtitleChar"/>
+    <w:uiPriority w:val="11"/>
+    <w:qFormat/>
+    <w:rsid w:val="00A10FD9"/>
+    <w:pPr>
+      <w:numPr>
+        <w:ilvl w:val="1"/>
+      </w:numPr>
+    </w:pPr>
+    <w:rPr>
+      <w:spacing w:val="15"/>
+      <w:sz w:val="28"/>
+      <w:szCs w:val="28"/>
+    </w:rPr>
+  </w:style>
+  <w:style w:type="character" w:customStyle="1" w:styleId="SubtitleChar">
+    <w:name w:val="Subtitle Char"/>
+    <w:basedOn w:val="DefaultParagraphFont"/>
+    <w:link w:val="Subtitle"/>
+    <w:uiPriority w:val="11"/>
+    <w:rsid w:val="00A10FD9"/>
+    <w:rPr>
+      <w:rFonts w:eastAsiaTheme="majorEastAsia" w:cstheme="majorBidi"/>
+      <w:color w:val="595959" w:themeColor="text1" w:themeTint="A6"/>
+      <w:spacing w:val="15"/>
+      <w:sz w:val="28"/>
+      <w:szCs w:val="28"/>
+    </w:rPr>
+  </w:style>
+  <w:style w:type="paragraph" w:customStyle="1" w:styleId="Author">
+    <w:name w:val="Author"/>
+    <w:basedOn w:val="Title"/>
+    <w:next w:val="BodyText"/>
+    <w:qFormat/>
+    <w:pPr>
+      <w:keepNext/>
+      <w:keepLines/>
+    </w:pPr>
+    <w:rPr>
+      <w:sz w:val="24"/>
+      <w:szCs w:val="24"/>
+    </w:rPr>
+  </w:style>
+  <w:style w:type="paragraph" w:styleId="Date">
+    <w:name w:val="Date"/>
+    <w:basedOn w:val="Title"/>
+    <w:next w:val="BodyText"/>
+    <w:qFormat/>
+    <w:pPr>
+      <w:keepNext/>
+      <w:keepLines/>
+    </w:pPr>
+    <w:rPr>
+      <w:sz w:val="24"/>
+      <w:szCs w:val="24"/>
+    </w:rPr>
+  </w:style>
+  <w:style w:type="paragraph" w:customStyle="1" w:styleId="AbstractTitle">
+    <w:name w:val="Abstract Title"/>
+    <w:basedOn w:val="Normal"/>
+    <w:next w:val="Abstract"/>
+    <w:qFormat/>
+    <w:pPr>
+      <w:keepNext/>
+      <w:keepLines/>
+      <w:spacing w:before="300" w:after="0"/>
+      <w:jc w:val="center"/>
+    </w:pPr>
+    <w:rPr>
+      <w:b/>
+      <w:sz w:val="20"/>
+      <w:szCs w:val="20"/>
+    </w:rPr>
+  </w:style>
+  <w:style w:type="paragraph" w:customStyle="1" w:styleId="Abstract">
+    <w:name w:val="Abstract"/>
+    <w:basedOn w:val="Normal"/>
+    <w:next w:val="BodyText"/>
+    <w:qFormat/>
+    <w:pPr>
+      <w:keepNext/>
+      <w:keepLines/>
+      <w:spacing w:before="100" w:after="300"/>
+    </w:pPr>
+    <w:rPr>
+      <w:sz w:val="20"/>
+      <w:szCs w:val="20"/>
+    </w:rPr>
+  </w:style>
+  <w:style w:type="paragraph" w:styleId="Bibliography">
+    <w:name w:val="Bibliography"/>
+    <w:basedOn w:val="Normal"/>
+    <w:qFormat/>
+  </w:style>
+  <w:style w:type="character" w:customStyle="1" w:styleId="Heading1Char">
     <w:name w:val="Heading 1 Char"/>
     <w:basedOn w:val="DefaultParagraphFont"/>
     <w:link w:val="Heading1"/>
     <w:uiPriority w:val="9"/>
     <w:rsid w:val="00A10FD9"/>
     <w:rPr>
-      <w:rFonts w:asciiTheme="majorHAnsi" w:cstheme="majorBidi" w:eastAsiaTheme="majorEastAsia" w:hAnsiTheme="majorHAnsi"/>
-      <w:color w:themeColor="accent1" w:themeShade="BF" w:val="0F4761"/>
+      <w:rFonts w:asciiTheme="majorHAnsi" w:eastAsiaTheme="majorEastAsia" w:hAnsiTheme="majorHAnsi" w:cstheme="majorBidi"/>
+      <w:color w:val="0F4761" w:themeColor="accent1" w:themeShade="BF"/>
       <w:sz w:val="40"/>
       <w:szCs w:val="40"/>
     </w:rPr>
   </w:style>
-  <w:style w:customStyle="1" w:styleId="Heading2Char" w:type="character">
+  <w:style w:type="character" w:customStyle="1" w:styleId="Heading2Char">
     <w:name w:val="Heading 2 Char"/>
     <w:basedOn w:val="DefaultParagraphFont"/>
     <w:link w:val="Heading2"/>
@@ -1497,13 +1753,13 @@
     <w:semiHidden/>
     <w:rsid w:val="00A10FD9"/>
     <w:rPr>
-      <w:rFonts w:asciiTheme="majorHAnsi" w:cstheme="majorBidi" w:eastAsiaTheme="majorEastAsia" w:hAnsiTheme="majorHAnsi"/>
-      <w:color w:themeColor="accent1" w:themeShade="BF" w:val="0F4761"/>
+      <w:rFonts w:asciiTheme="majorHAnsi" w:eastAsiaTheme="majorEastAsia" w:hAnsiTheme="majorHAnsi" w:cstheme="majorBidi"/>
+      <w:color w:val="0F4761" w:themeColor="accent1" w:themeShade="BF"/>
       <w:sz w:val="32"/>
       <w:szCs w:val="32"/>
     </w:rPr>
   </w:style>
-  <w:style w:customStyle="1" w:styleId="Heading3Char" w:type="character">
+  <w:style w:type="character" w:customStyle="1" w:styleId="Heading3Char">
     <w:name w:val="Heading 3 Char"/>
     <w:basedOn w:val="DefaultParagraphFont"/>
     <w:link w:val="Heading3"/>
@@ -1511,13 +1767,13 @@
     <w:semiHidden/>
     <w:rsid w:val="00A10FD9"/>
     <w:rPr>
-      <w:rFonts w:cstheme="majorBidi" w:eastAsiaTheme="majorEastAsia"/>
-      <w:color w:themeColor="accent1" w:themeShade="BF" w:val="0F4761"/>
+      <w:rFonts w:eastAsiaTheme="majorEastAsia" w:cstheme="majorBidi"/>
+      <w:color w:val="0F4761" w:themeColor="accent1" w:themeShade="BF"/>
       <w:sz w:val="28"/>
       <w:szCs w:val="28"/>
     </w:rPr>
   </w:style>
-  <w:style w:customStyle="1" w:styleId="Heading4Char" w:type="character">
+  <w:style w:type="character" w:customStyle="1" w:styleId="Heading4Char">
     <w:name w:val="Heading 4 Char"/>
     <w:basedOn w:val="DefaultParagraphFont"/>
     <w:link w:val="Heading4"/>
@@ -1525,13 +1781,13 @@
     <w:semiHidden/>
     <w:rsid w:val="00A10FD9"/>
     <w:rPr>
-      <w:rFonts w:cstheme="majorBidi" w:eastAsiaTheme="majorEastAsia"/>
+      <w:rFonts w:eastAsiaTheme="majorEastAsia" w:cstheme="majorBidi"/>
       <w:i/>
       <w:iCs/>
-      <w:color w:themeColor="accent1" w:themeShade="BF" w:val="0F4761"/>
-    </w:rPr>
-  </w:style>
-  <w:style w:customStyle="1" w:styleId="Heading5Char" w:type="character">
+      <w:color w:val="0F4761" w:themeColor="accent1" w:themeShade="BF"/>
+    </w:rPr>
+  </w:style>
+  <w:style w:type="character" w:customStyle="1" w:styleId="Heading5Char">
     <w:name w:val="Heading 5 Char"/>
     <w:basedOn w:val="DefaultParagraphFont"/>
     <w:link w:val="Heading5"/>
@@ -1539,11 +1795,11 @@
     <w:semiHidden/>
     <w:rsid w:val="00A10FD9"/>
     <w:rPr>
-      <w:rFonts w:cstheme="majorBidi" w:eastAsiaTheme="majorEastAsia"/>
-      <w:color w:themeColor="accent1" w:themeShade="BF" w:val="0F4761"/>
-    </w:rPr>
-  </w:style>
-  <w:style w:customStyle="1" w:styleId="Heading6Char" w:type="character">
+      <w:rFonts w:eastAsiaTheme="majorEastAsia" w:cstheme="majorBidi"/>
+      <w:color w:val="0F4761" w:themeColor="accent1" w:themeShade="BF"/>
+    </w:rPr>
+  </w:style>
+  <w:style w:type="character" w:customStyle="1" w:styleId="Heading6Char">
     <w:name w:val="Heading 6 Char"/>
     <w:basedOn w:val="DefaultParagraphFont"/>
     <w:link w:val="Heading6"/>
@@ -1551,13 +1807,13 @@
     <w:semiHidden/>
     <w:rsid w:val="00A10FD9"/>
     <w:rPr>
-      <w:rFonts w:cstheme="majorBidi" w:eastAsiaTheme="majorEastAsia"/>
+      <w:rFonts w:eastAsiaTheme="majorEastAsia" w:cstheme="majorBidi"/>
       <w:i/>
       <w:iCs/>
-      <w:color w:themeColor="text1" w:themeTint="A6" w:val="595959"/>
-    </w:rPr>
-  </w:style>
-  <w:style w:customStyle="1" w:styleId="Heading7Char" w:type="character">
+      <w:color w:val="595959" w:themeColor="text1" w:themeTint="A6"/>
+    </w:rPr>
+  </w:style>
+  <w:style w:type="character" w:customStyle="1" w:styleId="Heading7Char">
     <w:name w:val="Heading 7 Char"/>
     <w:basedOn w:val="DefaultParagraphFont"/>
     <w:link w:val="Heading7"/>
@@ -1565,11 +1821,11 @@
     <w:semiHidden/>
     <w:rsid w:val="00A10FD9"/>
     <w:rPr>
-      <w:rFonts w:cstheme="majorBidi" w:eastAsiaTheme="majorEastAsia"/>
-      <w:color w:themeColor="text1" w:themeTint="A6" w:val="595959"/>
-    </w:rPr>
-  </w:style>
-  <w:style w:customStyle="1" w:styleId="Heading8Char" w:type="character">
+      <w:rFonts w:eastAsiaTheme="majorEastAsia" w:cstheme="majorBidi"/>
+      <w:color w:val="595959" w:themeColor="text1" w:themeTint="A6"/>
+    </w:rPr>
+  </w:style>
+  <w:style w:type="character" w:customStyle="1" w:styleId="Heading8Char">
     <w:name w:val="Heading 8 Char"/>
     <w:basedOn w:val="DefaultParagraphFont"/>
     <w:link w:val="Heading8"/>
@@ -1577,13 +1833,13 @@
     <w:semiHidden/>
     <w:rsid w:val="00A10FD9"/>
     <w:rPr>
-      <w:rFonts w:cstheme="majorBidi" w:eastAsiaTheme="majorEastAsia"/>
+      <w:rFonts w:eastAsiaTheme="majorEastAsia" w:cstheme="majorBidi"/>
       <w:i/>
       <w:iCs/>
-      <w:color w:themeColor="text1" w:themeTint="D8" w:val="272727"/>
-    </w:rPr>
-  </w:style>
-  <w:style w:customStyle="1" w:styleId="Heading9Char" w:type="character">
+      <w:color w:val="272727" w:themeColor="text1" w:themeTint="D8"/>
+    </w:rPr>
+  </w:style>
+  <w:style w:type="character" w:customStyle="1" w:styleId="Heading9Char">
     <w:name w:val="Heading 9 Char"/>
     <w:basedOn w:val="DefaultParagraphFont"/>
     <w:link w:val="Heading9"/>
@@ -1591,11 +1847,11 @@
     <w:semiHidden/>
     <w:rsid w:val="00A10FD9"/>
     <w:rPr>
-      <w:rFonts w:cstheme="majorBidi" w:eastAsiaTheme="majorEastAsia"/>
-      <w:color w:themeColor="text1" w:themeTint="D8" w:val="272727"/>
-    </w:rPr>
-  </w:style>
-  <w:style w:styleId="BlockText" w:type="paragraph">
+      <w:rFonts w:eastAsiaTheme="majorEastAsia" w:cstheme="majorBidi"/>
+      <w:color w:val="272727" w:themeColor="text1" w:themeTint="D8"/>
+    </w:rPr>
+  </w:style>
+  <w:style w:type="paragraph" w:styleId="BlockText">
     <w:name w:val="Block Text"/>
     <w:basedOn w:val="BodyText"/>
     <w:next w:val="BodyText"/>
@@ -1603,19 +1859,18 @@
     <w:unhideWhenUsed/>
     <w:qFormat/>
     <w:pPr>
-      <w:spacing w:after="100" w:before="100"/>
-      <w:ind w:firstLine="0" w:left="480" w:right="480"/>
+      <w:spacing w:before="100" w:after="100"/>
+      <w:ind w:left="480" w:right="480"/>
     </w:pPr>
   </w:style>
-  <w:style w:styleId="FootnoteText" w:type="paragraph">
-    <w:name w:val="Footnote Text"/>
+  <w:style w:type="paragraph" w:styleId="FootnoteText">
+    <w:name w:val="footnote text"/>
     <w:basedOn w:val="Normal"/>
-    <w:next w:val="FootnoteText"/>
     <w:uiPriority w:val="9"/>
     <w:unhideWhenUsed/>
     <w:qFormat/>
   </w:style>
-  <w:style w:styleId="FootnoteBlockText" w:type="paragraph">
+  <w:style w:type="paragraph" w:customStyle="1" w:styleId="FootnoteBlockText">
     <w:name w:val="Footnote Block Text"/>
     <w:basedOn w:val="FootnoteText"/>
     <w:next w:val="FootnoteText"/>
@@ -1623,40 +1878,35 @@
     <w:unhideWhenUsed/>
     <w:qFormat/>
     <w:pPr>
-      <w:spacing w:after="100" w:before="100"/>
-      <w:ind w:firstLine="0" w:left="480" w:right="480"/>
+      <w:spacing w:before="100" w:after="100"/>
+      <w:ind w:left="480" w:right="480"/>
     </w:pPr>
   </w:style>
-  <w:style w:default="1" w:styleId="DefaultParagraphFont" w:type="character">
-    <w:name w:val="Default Paragraph Font"/>
-    <w:semiHidden/>
-    <w:unhideWhenUsed/>
-  </w:style>
-  <w:style w:default="1" w:styleId="Table" w:type="table">
+  <w:style w:type="table" w:customStyle="1" w:styleId="Table">
     <w:name w:val="Table"/>
-    <w:basedOn w:val="TableNormal"/>
     <w:semiHidden/>
     <w:unhideWhenUsed/>
     <w:qFormat/>
     <w:tblPr>
-      <w:tblInd w:type="dxa" w:w="0"/>
+      <w:tblInd w:w="0" w:type="dxa"/>
       <w:tblCellMar>
-        <w:top w:type="dxa" w:w="0"/>
-        <w:left w:type="dxa" w:w="108"/>
-        <w:bottom w:type="dxa" w:w="0"/>
-        <w:right w:type="dxa" w:w="108"/>
+        <w:top w:w="0" w:type="dxa"/>
+        <w:left w:w="108" w:type="dxa"/>
+        <w:bottom w:w="0" w:type="dxa"/>
+        <w:right w:w="108" w:type="dxa"/>
       </w:tblCellMar>
     </w:tblPr>
     <w:tblStylePr w:type="firstRow">
+      <w:tblPr/>
       <w:tcPr>
         <w:tcBorders>
-          <w:bottom w:val="single"/>
+          <w:bottom w:val="single" w:sz="0" w:space="0" w:color="auto"/>
         </w:tcBorders>
         <w:vAlign w:val="bottom"/>
       </w:tcPr>
     </w:tblStylePr>
   </w:style>
-  <w:style w:customStyle="1" w:styleId="DefinitionTerm" w:type="paragraph">
+  <w:style w:type="paragraph" w:customStyle="1" w:styleId="DefinitionTerm">
     <w:name w:val="Definition Term"/>
     <w:basedOn w:val="Normal"/>
     <w:next w:val="Definition"/>
@@ -1669,75 +1919,76 @@
       <w:b/>
     </w:rPr>
   </w:style>
-  <w:style w:customStyle="1" w:styleId="Definition" w:type="paragraph">
+  <w:style w:type="paragraph" w:customStyle="1" w:styleId="Definition">
     <w:name w:val="Definition"/>
     <w:basedOn w:val="Normal"/>
   </w:style>
-  <w:style w:styleId="Caption" w:type="paragraph">
-    <w:name w:val="Caption"/>
+  <w:style w:type="paragraph" w:styleId="Caption">
+    <w:name w:val="caption"/>
     <w:basedOn w:val="Normal"/>
-    <w:link w:val="BodyTextChar"/>
+    <w:link w:val="CaptionChar"/>
     <w:pPr>
-      <w:spacing w:after="120" w:before="0"/>
+      <w:spacing w:after="120"/>
     </w:pPr>
     <w:rPr>
       <w:i/>
     </w:rPr>
   </w:style>
-  <w:style w:customStyle="1" w:styleId="TableCaption" w:type="paragraph">
+  <w:style w:type="paragraph" w:customStyle="1" w:styleId="TableCaption">
     <w:name w:val="Table Caption"/>
     <w:basedOn w:val="Caption"/>
     <w:pPr>
       <w:keepNext/>
     </w:pPr>
   </w:style>
-  <w:style w:customStyle="1" w:styleId="ImageCaption" w:type="paragraph">
+  <w:style w:type="paragraph" w:customStyle="1" w:styleId="ImageCaption">
     <w:name w:val="Image Caption"/>
     <w:basedOn w:val="Caption"/>
   </w:style>
-  <w:style w:customStyle="1" w:styleId="Figure" w:type="paragraph">
+  <w:style w:type="paragraph" w:customStyle="1" w:styleId="Figure">
     <w:name w:val="Figure"/>
     <w:basedOn w:val="Normal"/>
   </w:style>
-  <w:style w:customStyle="1" w:styleId="CaptionedFigure" w:type="paragraph">
+  <w:style w:type="paragraph" w:customStyle="1" w:styleId="CaptionedFigure">
     <w:name w:val="Captioned Figure"/>
     <w:basedOn w:val="Figure"/>
     <w:pPr>
       <w:keepNext/>
     </w:pPr>
   </w:style>
-  <w:style w:customStyle="1" w:styleId="BodyTextChar" w:type="character">
-    <w:name w:val="Body Text Char"/>
+  <w:style w:type="character" w:customStyle="1" w:styleId="CaptionChar">
+    <w:name w:val="Caption Char"/>
     <w:basedOn w:val="DefaultParagraphFont"/>
-    <w:link w:val="BodyText"/>
-  </w:style>
-  <w:style w:customStyle="1" w:styleId="VerbatimChar" w:type="character">
+    <w:link w:val="Caption"/>
+  </w:style>
+  <w:style w:type="character" w:customStyle="1" w:styleId="VerbatimChar">
     <w:name w:val="Verbatim Char"/>
-    <w:basedOn w:val="BodyTextChar"/>
-    <w:rPr>
-      <w:rFonts w:ascii="Consolas" w:hAnsi="Consolas"/>
-      <w:sz w:val="22"/>
-    </w:rPr>
-  </w:style>
-  <w:style w:customStyle="1" w:styleId="SectionNumber" w:type="character">
+    <w:basedOn w:val="CaptionChar"/>
+    <w:link w:val="SourceCode"/>
+    <w:rPr>
+      <w:rFonts w:ascii="Consolas" w:hAnsi="Consolas"/>
+      <w:sz w:val="22"/>
+    </w:rPr>
+  </w:style>
+  <w:style w:type="character" w:customStyle="1" w:styleId="SectionNumber">
     <w:name w:val="Section Number"/>
-    <w:basedOn w:val="BodyTextChar"/>
-  </w:style>
-  <w:style w:styleId="FootnoteReference" w:type="character">
-    <w:name w:val="Footnote Reference"/>
-    <w:basedOn w:val="BodyTextChar"/>
+    <w:basedOn w:val="CaptionChar"/>
+  </w:style>
+  <w:style w:type="character" w:styleId="FootnoteReference">
+    <w:name w:val="footnote reference"/>
+    <w:basedOn w:val="CaptionChar"/>
     <w:rPr>
       <w:vertAlign w:val="superscript"/>
     </w:rPr>
   </w:style>
-  <w:style w:styleId="Hyperlink" w:type="character">
+  <w:style w:type="character" w:styleId="Hyperlink">
     <w:name w:val="Hyperlink"/>
-    <w:basedOn w:val="BodyTextChar"/>
-    <w:rPr>
-      <w:color w:themeColor="accent1" w:val="4F81BD"/>
-    </w:rPr>
-  </w:style>
-  <w:style w:styleId="TOCHeading" w:type="paragraph">
+    <w:basedOn w:val="CaptionChar"/>
+    <w:rPr>
+      <w:color w:val="156082" w:themeColor="accent1"/>
+    </w:rPr>
+  </w:style>
+  <w:style w:type="paragraph" w:styleId="TOCHeading">
     <w:name w:val="TOC Heading"/>
     <w:basedOn w:val="Heading1"/>
     <w:next w:val="BodyText"/>
@@ -1748,246 +1999,305 @@
       <w:spacing w:before="240" w:line="259" w:lineRule="auto"/>
       <w:outlineLvl w:val="9"/>
     </w:pPr>
-    <w:rPr>
-      <w:rFonts w:asciiTheme="majorHAnsi" w:cstheme="majorBidi" w:eastAsiaTheme="majorEastAsia" w:hAnsiTheme="majorHAnsi"/>
-      <w:b w:val="0"/>
-      <w:bCs w:val="0"/>
-      <w:color w:themeColor="accent1" w:themeShade="BF" w:val="365F91"/>
-    </w:rPr>
   </w:style>
   <w:style w:type="paragraph" w:customStyle="1" w:styleId="SourceCode">
     <w:name w:val="Source Code"/>
     <w:basedOn w:val="Normal"/>
     <w:link w:val="VerbatimChar"/>
     <w:pPr>
-      <w:wordWrap w:val="off"/>
+      <w:wordWrap w:val="0"/>
     </w:pPr>
   </w:style>
   <w:style w:type="character" w:customStyle="1" w:styleId="KeywordTok">
     <w:name w:val="KeywordTok"/>
     <w:basedOn w:val="VerbatimChar"/>
     <w:rPr>
+      <w:rFonts w:ascii="Consolas" w:hAnsi="Consolas"/>
       <w:b/>
       <w:color w:val="007020"/>
+      <w:sz w:val="22"/>
     </w:rPr>
   </w:style>
   <w:style w:type="character" w:customStyle="1" w:styleId="DataTypeTok">
     <w:name w:val="DataTypeTok"/>
     <w:basedOn w:val="VerbatimChar"/>
     <w:rPr>
+      <w:rFonts w:ascii="Consolas" w:hAnsi="Consolas"/>
       <w:color w:val="902000"/>
+      <w:sz w:val="22"/>
     </w:rPr>
   </w:style>
   <w:style w:type="character" w:customStyle="1" w:styleId="DecValTok">
     <w:name w:val="DecValTok"/>
     <w:basedOn w:val="VerbatimChar"/>
     <w:rPr>
-      <w:color w:val="40a070"/>
+      <w:rFonts w:ascii="Consolas" w:hAnsi="Consolas"/>
+      <w:color w:val="40A070"/>
+      <w:sz w:val="22"/>
     </w:rPr>
   </w:style>
   <w:style w:type="character" w:customStyle="1" w:styleId="BaseNTok">
     <w:name w:val="BaseNTok"/>
     <w:basedOn w:val="VerbatimChar"/>
     <w:rPr>
-      <w:color w:val="40a070"/>
+      <w:rFonts w:ascii="Consolas" w:hAnsi="Consolas"/>
+      <w:color w:val="40A070"/>
+      <w:sz w:val="22"/>
     </w:rPr>
   </w:style>
   <w:style w:type="character" w:customStyle="1" w:styleId="FloatTok">
     <w:name w:val="FloatTok"/>
     <w:basedOn w:val="VerbatimChar"/>
     <w:rPr>
-      <w:color w:val="40a070"/>
+      <w:rFonts w:ascii="Consolas" w:hAnsi="Consolas"/>
+      <w:color w:val="40A070"/>
+      <w:sz w:val="22"/>
     </w:rPr>
   </w:style>
   <w:style w:type="character" w:customStyle="1" w:styleId="ConstantTok">
     <w:name w:val="ConstantTok"/>
     <w:basedOn w:val="VerbatimChar"/>
     <w:rPr>
+      <w:rFonts w:ascii="Consolas" w:hAnsi="Consolas"/>
       <w:color w:val="880000"/>
+      <w:sz w:val="22"/>
     </w:rPr>
   </w:style>
   <w:style w:type="character" w:customStyle="1" w:styleId="CharTok">
     <w:name w:val="CharTok"/>
     <w:basedOn w:val="VerbatimChar"/>
     <w:rPr>
-      <w:color w:val="4070a0"/>
+      <w:rFonts w:ascii="Consolas" w:hAnsi="Consolas"/>
+      <w:color w:val="4070A0"/>
+      <w:sz w:val="22"/>
     </w:rPr>
   </w:style>
   <w:style w:type="character" w:customStyle="1" w:styleId="SpecialCharTok">
     <w:name w:val="SpecialCharTok"/>
     <w:basedOn w:val="VerbatimChar"/>
     <w:rPr>
-      <w:color w:val="4070a0"/>
+      <w:rFonts w:ascii="Consolas" w:hAnsi="Consolas"/>
+      <w:color w:val="4070A0"/>
+      <w:sz w:val="22"/>
     </w:rPr>
   </w:style>
   <w:style w:type="character" w:customStyle="1" w:styleId="StringTok">
     <w:name w:val="StringTok"/>
     <w:basedOn w:val="VerbatimChar"/>
     <w:rPr>
-      <w:color w:val="4070a0"/>
+      <w:rFonts w:ascii="Consolas" w:hAnsi="Consolas"/>
+      <w:color w:val="4070A0"/>
+      <w:sz w:val="22"/>
     </w:rPr>
   </w:style>
   <w:style w:type="character" w:customStyle="1" w:styleId="VerbatimStringTok">
     <w:name w:val="VerbatimStringTok"/>
     <w:basedOn w:val="VerbatimChar"/>
     <w:rPr>
-      <w:color w:val="4070a0"/>
+      <w:rFonts w:ascii="Consolas" w:hAnsi="Consolas"/>
+      <w:color w:val="4070A0"/>
+      <w:sz w:val="22"/>
     </w:rPr>
   </w:style>
   <w:style w:type="character" w:customStyle="1" w:styleId="SpecialStringTok">
     <w:name w:val="SpecialStringTok"/>
     <w:basedOn w:val="VerbatimChar"/>
     <w:rPr>
-      <w:color w:val="bb6688"/>
+      <w:rFonts w:ascii="Consolas" w:hAnsi="Consolas"/>
+      <w:color w:val="BB6688"/>
+      <w:sz w:val="22"/>
     </w:rPr>
   </w:style>
   <w:style w:type="character" w:customStyle="1" w:styleId="ImportTok">
     <w:name w:val="ImportTok"/>
     <w:basedOn w:val="VerbatimChar"/>
     <w:rPr>
+      <w:rFonts w:ascii="Consolas" w:hAnsi="Consolas"/>
       <w:b/>
       <w:color w:val="008000"/>
+      <w:sz w:val="22"/>
     </w:rPr>
   </w:style>
   <w:style w:type="character" w:customStyle="1" w:styleId="CommentTok">
     <w:name w:val="CommentTok"/>
     <w:basedOn w:val="VerbatimChar"/>
     <w:rPr>
+      <w:rFonts w:ascii="Consolas" w:hAnsi="Consolas"/>
       <w:i/>
-      <w:color w:val="60a0b0"/>
+      <w:color w:val="60A0B0"/>
+      <w:sz w:val="22"/>
     </w:rPr>
   </w:style>
   <w:style w:type="character" w:customStyle="1" w:styleId="DocumentationTok">
     <w:name w:val="DocumentationTok"/>
     <w:basedOn w:val="VerbatimChar"/>
     <w:rPr>
+      <w:rFonts w:ascii="Consolas" w:hAnsi="Consolas"/>
       <w:i/>
-      <w:color w:val="ba2121"/>
+      <w:color w:val="BA2121"/>
+      <w:sz w:val="22"/>
     </w:rPr>
   </w:style>
   <w:style w:type="character" w:customStyle="1" w:styleId="AnnotationTok">
     <w:name w:val="AnnotationTok"/>
     <w:basedOn w:val="VerbatimChar"/>
     <w:rPr>
+      <w:rFonts w:ascii="Consolas" w:hAnsi="Consolas"/>
       <w:b/>
       <w:i/>
-      <w:color w:val="60a0b0"/>
+      <w:color w:val="60A0B0"/>
+      <w:sz w:val="22"/>
     </w:rPr>
   </w:style>
   <w:style w:type="character" w:customStyle="1" w:styleId="CommentVarTok">
     <w:name w:val="CommentVarTok"/>
     <w:basedOn w:val="VerbatimChar"/>
     <w:rPr>
+      <w:rFonts w:ascii="Consolas" w:hAnsi="Consolas"/>
       <w:b/>
       <w:i/>
-      <w:color w:val="60a0b0"/>
+      <w:color w:val="60A0B0"/>
+      <w:sz w:val="22"/>
     </w:rPr>
   </w:style>
   <w:style w:type="character" w:customStyle="1" w:styleId="OtherTok">
     <w:name w:val="OtherTok"/>
     <w:basedOn w:val="VerbatimChar"/>
     <w:rPr>
+      <w:rFonts w:ascii="Consolas" w:hAnsi="Consolas"/>
       <w:color w:val="007020"/>
+      <w:sz w:val="22"/>
     </w:rPr>
   </w:style>
   <w:style w:type="character" w:customStyle="1" w:styleId="FunctionTok">
     <w:name w:val="FunctionTok"/>
     <w:basedOn w:val="VerbatimChar"/>
     <w:rPr>
-      <w:color w:val="06287e"/>
+      <w:rFonts w:ascii="Consolas" w:hAnsi="Consolas"/>
+      <w:color w:val="06287E"/>
+      <w:sz w:val="22"/>
     </w:rPr>
   </w:style>
   <w:style w:type="character" w:customStyle="1" w:styleId="VariableTok">
     <w:name w:val="VariableTok"/>
     <w:basedOn w:val="VerbatimChar"/>
     <w:rPr>
-      <w:color w:val="19177c"/>
+      <w:rFonts w:ascii="Consolas" w:hAnsi="Consolas"/>
+      <w:color w:val="19177C"/>
+      <w:sz w:val="22"/>
     </w:rPr>
   </w:style>
   <w:style w:type="character" w:customStyle="1" w:styleId="ControlFlowTok">
     <w:name w:val="ControlFlowTok"/>
     <w:basedOn w:val="VerbatimChar"/>
     <w:rPr>
+      <w:rFonts w:ascii="Consolas" w:hAnsi="Consolas"/>
       <w:b/>
       <w:color w:val="007020"/>
+      <w:sz w:val="22"/>
     </w:rPr>
   </w:style>
   <w:style w:type="character" w:customStyle="1" w:styleId="OperatorTok">
     <w:name w:val="OperatorTok"/>
     <w:basedOn w:val="VerbatimChar"/>
     <w:rPr>
+      <w:rFonts w:ascii="Consolas" w:hAnsi="Consolas"/>
       <w:color w:val="666666"/>
+      <w:sz w:val="22"/>
     </w:rPr>
   </w:style>
   <w:style w:type="character" w:customStyle="1" w:styleId="BuiltInTok">
     <w:name w:val="BuiltInTok"/>
     <w:basedOn w:val="VerbatimChar"/>
     <w:rPr>
+      <w:rFonts w:ascii="Consolas" w:hAnsi="Consolas"/>
       <w:color w:val="008000"/>
+      <w:sz w:val="22"/>
     </w:rPr>
   </w:style>
   <w:style w:type="character" w:customStyle="1" w:styleId="ExtensionTok">
     <w:name w:val="ExtensionTok"/>
     <w:basedOn w:val="VerbatimChar"/>
-    <w:rPr/>
+    <w:rPr>
+      <w:rFonts w:ascii="Consolas" w:hAnsi="Consolas"/>
+      <w:sz w:val="22"/>
+    </w:rPr>
   </w:style>
   <w:style w:type="character" w:customStyle="1" w:styleId="PreprocessorTok">
     <w:name w:val="PreprocessorTok"/>
     <w:basedOn w:val="VerbatimChar"/>
     <w:rPr>
-      <w:color w:val="bc7a00"/>
+      <w:rFonts w:ascii="Consolas" w:hAnsi="Consolas"/>
+      <w:color w:val="BC7A00"/>
+      <w:sz w:val="22"/>
     </w:rPr>
   </w:style>
   <w:style w:type="character" w:customStyle="1" w:styleId="AttributeTok">
     <w:name w:val="AttributeTok"/>
     <w:basedOn w:val="VerbatimChar"/>
     <w:rPr>
-      <w:color w:val="7d9029"/>
+      <w:rFonts w:ascii="Consolas" w:hAnsi="Consolas"/>
+      <w:color w:val="7D9029"/>
+      <w:sz w:val="22"/>
     </w:rPr>
   </w:style>
   <w:style w:type="character" w:customStyle="1" w:styleId="RegionMarkerTok">
     <w:name w:val="RegionMarkerTok"/>
     <w:basedOn w:val="VerbatimChar"/>
-    <w:rPr/>
+    <w:rPr>
+      <w:rFonts w:ascii="Consolas" w:hAnsi="Consolas"/>
+      <w:sz w:val="22"/>
+    </w:rPr>
   </w:style>
   <w:style w:type="character" w:customStyle="1" w:styleId="InformationTok">
     <w:name w:val="InformationTok"/>
     <w:basedOn w:val="VerbatimChar"/>
     <w:rPr>
+      <w:rFonts w:ascii="Consolas" w:hAnsi="Consolas"/>
       <w:b/>
       <w:i/>
-      <w:color w:val="60a0b0"/>
+      <w:color w:val="60A0B0"/>
+      <w:sz w:val="22"/>
     </w:rPr>
   </w:style>
   <w:style w:type="character" w:customStyle="1" w:styleId="WarningTok">
     <w:name w:val="WarningTok"/>
     <w:basedOn w:val="VerbatimChar"/>
     <w:rPr>
+      <w:rFonts w:ascii="Consolas" w:hAnsi="Consolas"/>
       <w:b/>
       <w:i/>
-      <w:color w:val="60a0b0"/>
+      <w:color w:val="60A0B0"/>
+      <w:sz w:val="22"/>
     </w:rPr>
   </w:style>
   <w:style w:type="character" w:customStyle="1" w:styleId="AlertTok">
     <w:name w:val="AlertTok"/>
     <w:basedOn w:val="VerbatimChar"/>
     <w:rPr>
+      <w:rFonts w:ascii="Consolas" w:hAnsi="Consolas"/>
       <w:b/>
-      <w:color w:val="ff0000"/>
+      <w:color w:val="FF0000"/>
+      <w:sz w:val="22"/>
     </w:rPr>
   </w:style>
   <w:style w:type="character" w:customStyle="1" w:styleId="ErrorTok">
     <w:name w:val="ErrorTok"/>
     <w:basedOn w:val="VerbatimChar"/>
     <w:rPr>
+      <w:rFonts w:ascii="Consolas" w:hAnsi="Consolas"/>
       <w:b/>
-      <w:color w:val="ff0000"/>
+      <w:color w:val="FF0000"/>
+      <w:sz w:val="22"/>
     </w:rPr>
   </w:style>
   <w:style w:type="character" w:customStyle="1" w:styleId="NormalTok">
     <w:name w:val="NormalTok"/>
     <w:basedOn w:val="VerbatimChar"/>
-    <w:rPr/>
+    <w:rPr>
+      <w:rFonts w:ascii="Consolas" w:hAnsi="Consolas"/>
+      <w:sz w:val="22"/>
+    </w:rPr>
   </w:style>
 </w:styles>
 </file>

</xml_diff>